<commit_message>
Cambios en la produccion / local
Cambios en la produccion / local
</commit_message>
<xml_diff>
--- a/plantilla.docx
+++ b/plantilla.docx
@@ -3,28 +3,346 @@
 <w:document xmlns:wpc="http://schemas.microsoft.com/office/word/2010/wordprocessingCanvas" xmlns:cx="http://schemas.microsoft.com/office/drawing/2014/chartex" xmlns:cx1="http://schemas.microsoft.com/office/drawing/2015/9/8/chartex" xmlns:cx2="http://schemas.microsoft.com/office/drawing/2015/10/21/chartex" xmlns:cx3="http://schemas.microsoft.com/office/drawing/2016/5/9/chartex" xmlns:cx4="http://schemas.microsoft.com/office/drawing/2016/5/10/chartex" xmlns:cx5="http://schemas.microsoft.com/office/drawing/2016/5/11/chartex" xmlns:cx6="http://schemas.microsoft.com/office/drawing/2016/5/12/chartex" xmlns:cx7="http://schemas.microsoft.com/office/drawing/2016/5/13/chartex" xmlns:cx8="http://schemas.microsoft.com/office/drawing/2016/5/14/chartex" xmlns:mc="http://schemas.openxmlformats.org/markup-compatibility/2006" xmlns:aink="http://schemas.microsoft.com/office/drawing/2016/ink" xmlns:am3d="http://schemas.microsoft.com/office/drawing/2017/model3d" xmlns:o="urn:schemas-microsoft-com:office:office" xmlns:oel="http://schemas.microsoft.com/office/2019/extlst" xmlns:r="http://schemas.openxmlformats.org/officeDocument/2006/relationships" xmlns:m="http://schemas.openxmlformats.org/officeDocument/2006/math" xmlns:v="urn:schemas-microsoft-com:vml" xmlns:wp14="http://schemas.microsoft.com/office/word/2010/wordprocessingDrawing" xmlns:wp="http://schemas.openxmlformats.org/drawingml/2006/wordprocessingDrawing" xmlns:w10="urn:schemas-microsoft-com:office:word" xmlns:w="http://schemas.openxmlformats.org/wordprocessingml/2006/main" xmlns:w14="http://schemas.microsoft.com/office/word/2010/wordml" xmlns:w15="http://schemas.microsoft.com/office/word/2012/wordml" xmlns:w16cex="http://schemas.microsoft.com/office/word/2018/wordml/cex" xmlns:w16cid="http://schemas.microsoft.com/office/word/2016/wordml/cid" xmlns:w16="http://schemas.microsoft.com/office/word/2018/wordml" xmlns:w16du="http://schemas.microsoft.com/office/word/2023/wordml/word16du" xmlns:w16sdtdh="http://schemas.microsoft.com/office/word/2020/wordml/sdtdatahash" xmlns:w16sdtfl="http://schemas.microsoft.com/office/word/2024/wordml/sdtformatlock" xmlns:w16se="http://schemas.microsoft.com/office/word/2015/wordml/symex" xmlns:wpg="http://schemas.microsoft.com/office/word/2010/wordprocessingGroup" xmlns:wpi="http://schemas.microsoft.com/office/word/2010/wordprocessingInk" xmlns:wne="http://schemas.microsoft.com/office/word/2006/wordml" xmlns:wps="http://schemas.microsoft.com/office/word/2010/wordprocessingShape" mc:Ignorable="w14 w15 w16se w16cid w16 w16cex w16sdtdh w16sdtfl w16du wp14">
   <w:body>
     <w:p>
+      <w:pPr>
+        <w:rPr>
+          <w:rFonts w:ascii="Arial Narrow" w:hAnsi="Arial Narrow"/>
+          <w:b/>
+          <w:bCs/>
+          <w:sz w:val="20"/>
+          <w:szCs w:val="20"/>
+        </w:rPr>
+      </w:pPr>
       <w:r>
-        <w:t>CARPETA: {{carpeta}}</w:t>
+        <w:rPr>
+          <w:rFonts w:ascii="Arial Narrow" w:hAnsi="Arial Narrow"/>
+          <w:b/>
+          <w:bCs/>
+          <w:sz w:val="20"/>
+          <w:szCs w:val="20"/>
+        </w:rPr>
+        <w:t>ASUNTO: REMITIR INDICIOS</w:t>
       </w:r>
-    </w:p>
-    <w:p/>
-    <w:p>
       <w:r>
-        <w:t>DESCRIPCIÓN:</w:t>
+        <w:rPr>
+          <w:rFonts w:ascii="Arial Narrow" w:hAnsi="Arial Narrow"/>
+          <w:b/>
+          <w:bCs/>
+          <w:sz w:val="20"/>
+          <w:szCs w:val="20"/>
+        </w:rPr>
+        <w:br/>
+      </w:r>
+      <w:r>
+        <w:rPr>
+          <w:rFonts w:ascii="Arial Narrow" w:hAnsi="Arial Narrow"/>
+          <w:b/>
+          <w:bCs/>
+          <w:sz w:val="20"/>
+          <w:szCs w:val="20"/>
+        </w:rPr>
+        <w:t>LICENCIADO HUGO ENRIQUE DURAN SIERRA</w:t>
+      </w:r>
+      <w:r>
+        <w:rPr>
+          <w:rFonts w:ascii="Arial Narrow" w:hAnsi="Arial Narrow"/>
+          <w:b/>
+          <w:bCs/>
+          <w:sz w:val="20"/>
+          <w:szCs w:val="20"/>
+        </w:rPr>
+        <w:br/>
+      </w:r>
+      <w:r>
+        <w:rPr>
+          <w:rFonts w:ascii="Arial Narrow" w:hAnsi="Arial Narrow"/>
+          <w:b/>
+          <w:bCs/>
+          <w:sz w:val="20"/>
+          <w:szCs w:val="20"/>
+        </w:rPr>
+        <w:t>COORDINADOR DEL ALMACEN GENERAL DE INDICIOS Y EVIDENCIAS DE LA AGENCIA DE INVESTIGACION</w:t>
+      </w:r>
+      <w:r>
+        <w:rPr>
+          <w:rFonts w:ascii="Arial Narrow" w:hAnsi="Arial Narrow"/>
+          <w:b/>
+          <w:bCs/>
+          <w:sz w:val="20"/>
+          <w:szCs w:val="20"/>
+        </w:rPr>
+        <w:br/>
+      </w:r>
+      <w:r>
+        <w:rPr>
+          <w:rFonts w:ascii="Arial Narrow" w:hAnsi="Arial Narrow"/>
+          <w:b/>
+          <w:bCs/>
+          <w:sz w:val="20"/>
+          <w:szCs w:val="20"/>
+        </w:rPr>
+        <w:t>CRIMINAL</w:t>
       </w:r>
     </w:p>
     <w:p>
+      <w:pPr>
+        <w:jc w:val="both"/>
+        <w:rPr>
+          <w:rFonts w:ascii="Arial Narrow" w:hAnsi="Arial Narrow"/>
+          <w:sz w:val="20"/>
+          <w:szCs w:val="20"/>
+          <w:u w:val="single"/>
+        </w:rPr>
+      </w:pPr>
       <w:r>
-        <w:t>{{descripcion}}</w:t>
+        <w:rPr>
+          <w:rFonts w:ascii="Arial Narrow" w:hAnsi="Arial Narrow"/>
+          <w:sz w:val="20"/>
+          <w:szCs w:val="20"/>
+        </w:rPr>
+        <w:t>Por medio de la presente y de la manera más atenta me dirijo a usted con la finalidad de que tenga a bien permitir el ingreso de los indicios consistente en:</w:t>
       </w:r>
     </w:p>
-    <w:p/>
     <w:p>
+      <w:pPr>
+        <w:jc w:val="both"/>
+        <w:rPr>
+          <w:rFonts w:ascii="Arial Narrow" w:hAnsi="Arial Narrow"/>
+          <w:b/>
+          <w:bCs/>
+          <w:sz w:val="20"/>
+          <w:szCs w:val="20"/>
+        </w:rPr>
+      </w:pPr>
       <w:r>
-        <w:t>AGENCIA: {{agencia}}</w:t>
+        <w:rPr>
+          <w:rFonts w:ascii="Arial Narrow" w:hAnsi="Arial Narrow"/>
+          <w:b/>
+          <w:bCs/>
+          <w:sz w:val="20"/>
+          <w:szCs w:val="20"/>
+        </w:rPr>
+        <w:t>{{</w:t>
+      </w:r>
+      <w:proofErr w:type="spellStart"/>
+      <w:r>
+        <w:rPr>
+          <w:rFonts w:ascii="Arial Narrow" w:hAnsi="Arial Narrow"/>
+          <w:b/>
+          <w:bCs/>
+          <w:sz w:val="20"/>
+          <w:szCs w:val="20"/>
+        </w:rPr>
+        <w:t>descripcion</w:t>
+      </w:r>
+      <w:proofErr w:type="spellEnd"/>
+      <w:r>
+        <w:rPr>
+          <w:rFonts w:ascii="Arial Narrow" w:hAnsi="Arial Narrow"/>
+          <w:b/>
+          <w:bCs/>
+          <w:sz w:val="20"/>
+          <w:szCs w:val="20"/>
+        </w:rPr>
+        <w:t>}}</w:t>
+      </w:r>
+    </w:p>
+    <w:p>
+      <w:pPr>
+        <w:jc w:val="both"/>
+        <w:rPr>
+          <w:rFonts w:ascii="Arial Narrow" w:hAnsi="Arial Narrow"/>
+          <w:sz w:val="20"/>
+          <w:szCs w:val="20"/>
+        </w:rPr>
+      </w:pPr>
+      <w:r>
+        <w:rPr>
+          <w:rFonts w:ascii="Arial Narrow" w:hAnsi="Arial Narrow"/>
+          <w:sz w:val="20"/>
+          <w:szCs w:val="20"/>
+        </w:rPr>
+        <w:t>Los cuales se encuentran descrito en la misma cadena de custodia y fue debidamente recabado, embaladas, lacradas y etiquetadas con su respectiva cadena de custodia.</w:t>
+      </w:r>
+    </w:p>
+    <w:p>
+      <w:pPr>
+        <w:jc w:val="both"/>
+        <w:rPr>
+          <w:rFonts w:ascii="Arial Narrow" w:hAnsi="Arial Narrow"/>
+          <w:sz w:val="20"/>
+          <w:szCs w:val="20"/>
+        </w:rPr>
+      </w:pPr>
+      <w:r>
+        <w:rPr>
+          <w:rFonts w:ascii="Arial Narrow" w:hAnsi="Arial Narrow"/>
+          <w:sz w:val="20"/>
+          <w:szCs w:val="20"/>
+        </w:rPr>
+        <w:t>Se solicita se almacena hasta determinar su destino final o mandarlo a estudio.</w:t>
+      </w:r>
+    </w:p>
+    <w:p>
+      <w:pPr>
+        <w:jc w:val="both"/>
+        <w:rPr>
+          <w:rFonts w:ascii="Arial Narrow" w:hAnsi="Arial Narrow"/>
+          <w:sz w:val="20"/>
+          <w:szCs w:val="20"/>
+        </w:rPr>
+      </w:pPr>
+      <w:r>
+        <w:rPr>
+          <w:rFonts w:ascii="Arial Narrow" w:hAnsi="Arial Narrow"/>
+          <w:sz w:val="20"/>
+          <w:szCs w:val="20"/>
+        </w:rPr>
+        <w:t>Lo anterior tiene fundamento en los artículos 21 de la Constitución Política de los Estados Unidos Mexicanos, 11 de la Constitución Política para el Estado de Guanajuato, 131 fracciones III, IV, V, VIII y IX, 227 y 228 del Código Nacional de Procedimientos Penales.</w:t>
+      </w:r>
+    </w:p>
+    <w:p>
+      <w:pPr>
+        <w:jc w:val="both"/>
+        <w:rPr>
+          <w:rFonts w:ascii="Arial Narrow" w:hAnsi="Arial Narrow"/>
+          <w:sz w:val="20"/>
+          <w:szCs w:val="20"/>
+        </w:rPr>
+      </w:pPr>
+      <w:r>
+        <w:rPr>
+          <w:rFonts w:ascii="Arial Narrow" w:hAnsi="Arial Narrow"/>
+          <w:sz w:val="20"/>
+          <w:szCs w:val="20"/>
+        </w:rPr>
+        <w:t>Sin otro particular por el momento reitero a usted, las seguridades de mi atenta y distinguida consideración.</w:t>
+      </w:r>
+    </w:p>
+    <w:p>
+      <w:pPr>
+        <w:rPr>
+          <w:rFonts w:ascii="Arial Narrow" w:hAnsi="Arial Narrow"/>
+          <w:sz w:val="20"/>
+          <w:szCs w:val="20"/>
+        </w:rPr>
+      </w:pPr>
+      <w:r>
+        <w:rPr>
+          <w:rFonts w:ascii="Arial Narrow" w:hAnsi="Arial Narrow"/>
+          <w:sz w:val="20"/>
+          <w:szCs w:val="20"/>
+        </w:rPr>
+        <w:t xml:space="preserve">ATENTAMENTE: </w:t>
+      </w:r>
+    </w:p>
+    <w:p>
+      <w:pPr>
+        <w:rPr>
+          <w:rFonts w:ascii="Arial Narrow" w:hAnsi="Arial Narrow"/>
+          <w:b/>
+          <w:bCs/>
+          <w:sz w:val="20"/>
+          <w:szCs w:val="20"/>
+          <w:u w:val="single"/>
+        </w:rPr>
+      </w:pPr>
+      <w:r>
+        <w:rPr>
+          <w:rFonts w:ascii="Arial Narrow" w:hAnsi="Arial Narrow"/>
+          <w:b/>
+          <w:bCs/>
+          <w:sz w:val="20"/>
+          <w:szCs w:val="20"/>
+          <w:highlight w:val="yellow"/>
+        </w:rPr>
+        <w:t>IRAPUATO, GUANAJUATO</w:t>
+      </w:r>
+      <w:r>
+        <w:rPr>
+          <w:rFonts w:ascii="Arial Narrow" w:hAnsi="Arial Narrow"/>
+          <w:b/>
+          <w:bCs/>
+          <w:sz w:val="20"/>
+          <w:szCs w:val="20"/>
+        </w:rPr>
+        <w:br/>
+      </w:r>
+      <w:sdt>
+        <w:sdtPr>
+          <w:rPr>
+            <w:rFonts w:ascii="Arial Narrow" w:hAnsi="Arial Narrow"/>
+            <w:b/>
+            <w:bCs/>
+            <w:sz w:val="20"/>
+            <w:szCs w:val="20"/>
+          </w:rPr>
+          <w:id w:val="1106232418"/>
+          <w:placeholder>
+            <w:docPart w:val="DefaultPlaceholder_-1854013437"/>
+          </w:placeholder>
+          <w:date w:fullDate="2026-04-30T00:00:00Z">
+            <w:dateFormat w:val="d' de 'MMMM' de 'yyyy"/>
+            <w:lid w:val="es-MX"/>
+            <w:storeMappedDataAs w:val="dateTime"/>
+            <w:calendar w:val="gregorian"/>
+          </w:date>
+        </w:sdtPr>
+        <w:sdtContent>
+          <w:r>
+            <w:rPr>
+              <w:rFonts w:ascii="Arial Narrow" w:hAnsi="Arial Narrow"/>
+              <w:b/>
+              <w:bCs/>
+              <w:sz w:val="20"/>
+              <w:szCs w:val="20"/>
+            </w:rPr>
+            <w:t>30 de abril de 2026</w:t>
+          </w:r>
+        </w:sdtContent>
+      </w:sdt>
+      <w:r>
+        <w:rPr>
+          <w:rFonts w:ascii="Arial Narrow" w:hAnsi="Arial Narrow"/>
+          <w:b/>
+          <w:bCs/>
+          <w:sz w:val="20"/>
+          <w:szCs w:val="20"/>
+        </w:rPr>
+        <w:br/>
+      </w:r>
+      <w:r>
+        <w:rPr>
+          <w:rFonts w:ascii="Arial Narrow" w:hAnsi="Arial Narrow"/>
+          <w:b/>
+          <w:bCs/>
+          <w:sz w:val="20"/>
+          <w:szCs w:val="20"/>
+          <w:highlight w:val="yellow"/>
+        </w:rPr>
+        <w:t>LIC. MA DE LOURDES AVALOS GONZALEZ</w:t>
+      </w:r>
+      <w:r>
+        <w:rPr>
+          <w:rFonts w:ascii="Arial Narrow" w:hAnsi="Arial Narrow"/>
+          <w:b/>
+          <w:bCs/>
+          <w:sz w:val="20"/>
+          <w:szCs w:val="20"/>
+        </w:rPr>
+        <w:br/>
+        <w:t>AGENTE DEL MINISTERIO PÚBLICO {{agencia}}</w:t>
+      </w:r>
+      <w:r>
+        <w:rPr>
+          <w:rFonts w:ascii="Arial Narrow" w:hAnsi="Arial Narrow"/>
+          <w:sz w:val="20"/>
+          <w:szCs w:val="20"/>
+        </w:rPr>
+        <w:t xml:space="preserve"> </w:t>
       </w:r>
     </w:p>
     <w:sectPr>
+      <w:headerReference w:type="default" r:id="rId6"/>
       <w:pgSz w:w="12240" w:h="15840"/>
       <w:pgMar w:top="1417" w:right="1701" w:bottom="1417" w:left="1701" w:header="708" w:footer="708" w:gutter="0"/>
       <w:cols w:space="708"/>
@@ -32,6 +350,319 @@
     </w:sectPr>
   </w:body>
 </w:document>
+</file>
+
+<file path=word/endnotes.xml><?xml version="1.0" encoding="utf-8"?>
+<w:endnotes xmlns:wpc="http://schemas.microsoft.com/office/word/2010/wordprocessingCanvas" xmlns:cx="http://schemas.microsoft.com/office/drawing/2014/chartex" xmlns:cx1="http://schemas.microsoft.com/office/drawing/2015/9/8/chartex" xmlns:cx2="http://schemas.microsoft.com/office/drawing/2015/10/21/chartex" xmlns:cx3="http://schemas.microsoft.com/office/drawing/2016/5/9/chartex" xmlns:cx4="http://schemas.microsoft.com/office/drawing/2016/5/10/chartex" xmlns:cx5="http://schemas.microsoft.com/office/drawing/2016/5/11/chartex" xmlns:cx6="http://schemas.microsoft.com/office/drawing/2016/5/12/chartex" xmlns:cx7="http://schemas.microsoft.com/office/drawing/2016/5/13/chartex" xmlns:cx8="http://schemas.microsoft.com/office/drawing/2016/5/14/chartex" xmlns:mc="http://schemas.openxmlformats.org/markup-compatibility/2006" xmlns:aink="http://schemas.microsoft.com/office/drawing/2016/ink" xmlns:am3d="http://schemas.microsoft.com/office/drawing/2017/model3d" xmlns:o="urn:schemas-microsoft-com:office:office" xmlns:oel="http://schemas.microsoft.com/office/2019/extlst" xmlns:r="http://schemas.openxmlformats.org/officeDocument/2006/relationships" xmlns:m="http://schemas.openxmlformats.org/officeDocument/2006/math" xmlns:v="urn:schemas-microsoft-com:vml" xmlns:wp14="http://schemas.microsoft.com/office/word/2010/wordprocessingDrawing" xmlns:wp="http://schemas.openxmlformats.org/drawingml/2006/wordprocessingDrawing" xmlns:w10="urn:schemas-microsoft-com:office:word" xmlns:w="http://schemas.openxmlformats.org/wordprocessingml/2006/main" xmlns:w14="http://schemas.microsoft.com/office/word/2010/wordml" xmlns:w15="http://schemas.microsoft.com/office/word/2012/wordml" xmlns:w16cex="http://schemas.microsoft.com/office/word/2018/wordml/cex" xmlns:w16cid="http://schemas.microsoft.com/office/word/2016/wordml/cid" xmlns:w16="http://schemas.microsoft.com/office/word/2018/wordml" xmlns:w16du="http://schemas.microsoft.com/office/word/2023/wordml/word16du" xmlns:w16sdtdh="http://schemas.microsoft.com/office/word/2020/wordml/sdtdatahash" xmlns:w16sdtfl="http://schemas.microsoft.com/office/word/2024/wordml/sdtformatlock" xmlns:w16se="http://schemas.microsoft.com/office/word/2015/wordml/symex" xmlns:wpg="http://schemas.microsoft.com/office/word/2010/wordprocessingGroup" xmlns:wpi="http://schemas.microsoft.com/office/word/2010/wordprocessingInk" xmlns:wne="http://schemas.microsoft.com/office/word/2006/wordml" xmlns:wps="http://schemas.microsoft.com/office/word/2010/wordprocessingShape" mc:Ignorable="w14 w15 w16se w16cid w16 w16cex w16sdtdh w16sdtfl w16du wp14">
+  <w:endnote w:type="separator" w:id="-1">
+    <w:p>
+      <w:pPr>
+        <w:spacing w:after="0" w:line="240" w:lineRule="auto"/>
+      </w:pPr>
+      <w:r>
+        <w:separator/>
+      </w:r>
+    </w:p>
+  </w:endnote>
+  <w:endnote w:type="continuationSeparator" w:id="0">
+    <w:p>
+      <w:pPr>
+        <w:spacing w:after="0" w:line="240" w:lineRule="auto"/>
+      </w:pPr>
+      <w:r>
+        <w:continuationSeparator/>
+      </w:r>
+    </w:p>
+  </w:endnote>
+</w:endnotes>
+</file>
+
+<file path=word/footnotes.xml><?xml version="1.0" encoding="utf-8"?>
+<w:footnotes xmlns:wpc="http://schemas.microsoft.com/office/word/2010/wordprocessingCanvas" xmlns:cx="http://schemas.microsoft.com/office/drawing/2014/chartex" xmlns:cx1="http://schemas.microsoft.com/office/drawing/2015/9/8/chartex" xmlns:cx2="http://schemas.microsoft.com/office/drawing/2015/10/21/chartex" xmlns:cx3="http://schemas.microsoft.com/office/drawing/2016/5/9/chartex" xmlns:cx4="http://schemas.microsoft.com/office/drawing/2016/5/10/chartex" xmlns:cx5="http://schemas.microsoft.com/office/drawing/2016/5/11/chartex" xmlns:cx6="http://schemas.microsoft.com/office/drawing/2016/5/12/chartex" xmlns:cx7="http://schemas.microsoft.com/office/drawing/2016/5/13/chartex" xmlns:cx8="http://schemas.microsoft.com/office/drawing/2016/5/14/chartex" xmlns:mc="http://schemas.openxmlformats.org/markup-compatibility/2006" xmlns:aink="http://schemas.microsoft.com/office/drawing/2016/ink" xmlns:am3d="http://schemas.microsoft.com/office/drawing/2017/model3d" xmlns:o="urn:schemas-microsoft-com:office:office" xmlns:oel="http://schemas.microsoft.com/office/2019/extlst" xmlns:r="http://schemas.openxmlformats.org/officeDocument/2006/relationships" xmlns:m="http://schemas.openxmlformats.org/officeDocument/2006/math" xmlns:v="urn:schemas-microsoft-com:vml" xmlns:wp14="http://schemas.microsoft.com/office/word/2010/wordprocessingDrawing" xmlns:wp="http://schemas.openxmlformats.org/drawingml/2006/wordprocessingDrawing" xmlns:w10="urn:schemas-microsoft-com:office:word" xmlns:w="http://schemas.openxmlformats.org/wordprocessingml/2006/main" xmlns:w14="http://schemas.microsoft.com/office/word/2010/wordml" xmlns:w15="http://schemas.microsoft.com/office/word/2012/wordml" xmlns:w16cex="http://schemas.microsoft.com/office/word/2018/wordml/cex" xmlns:w16cid="http://schemas.microsoft.com/office/word/2016/wordml/cid" xmlns:w16="http://schemas.microsoft.com/office/word/2018/wordml" xmlns:w16du="http://schemas.microsoft.com/office/word/2023/wordml/word16du" xmlns:w16sdtdh="http://schemas.microsoft.com/office/word/2020/wordml/sdtdatahash" xmlns:w16sdtfl="http://schemas.microsoft.com/office/word/2024/wordml/sdtformatlock" xmlns:w16se="http://schemas.microsoft.com/office/word/2015/wordml/symex" xmlns:wpg="http://schemas.microsoft.com/office/word/2010/wordprocessingGroup" xmlns:wpi="http://schemas.microsoft.com/office/word/2010/wordprocessingInk" xmlns:wne="http://schemas.microsoft.com/office/word/2006/wordml" xmlns:wps="http://schemas.microsoft.com/office/word/2010/wordprocessingShape" mc:Ignorable="w14 w15 w16se w16cid w16 w16cex w16sdtdh w16sdtfl w16du wp14">
+  <w:footnote w:type="separator" w:id="-1">
+    <w:p>
+      <w:pPr>
+        <w:spacing w:after="0" w:line="240" w:lineRule="auto"/>
+      </w:pPr>
+      <w:r>
+        <w:separator/>
+      </w:r>
+    </w:p>
+  </w:footnote>
+  <w:footnote w:type="continuationSeparator" w:id="0">
+    <w:p>
+      <w:pPr>
+        <w:spacing w:after="0" w:line="240" w:lineRule="auto"/>
+      </w:pPr>
+      <w:r>
+        <w:continuationSeparator/>
+      </w:r>
+    </w:p>
+  </w:footnote>
+</w:footnotes>
+</file>
+
+<file path=word/header1.xml><?xml version="1.0" encoding="utf-8"?>
+<w:hdr xmlns:wpc="http://schemas.microsoft.com/office/word/2010/wordprocessingCanvas" xmlns:cx="http://schemas.microsoft.com/office/drawing/2014/chartex" xmlns:cx1="http://schemas.microsoft.com/office/drawing/2015/9/8/chartex" xmlns:cx2="http://schemas.microsoft.com/office/drawing/2015/10/21/chartex" xmlns:cx3="http://schemas.microsoft.com/office/drawing/2016/5/9/chartex" xmlns:cx4="http://schemas.microsoft.com/office/drawing/2016/5/10/chartex" xmlns:cx5="http://schemas.microsoft.com/office/drawing/2016/5/11/chartex" xmlns:cx6="http://schemas.microsoft.com/office/drawing/2016/5/12/chartex" xmlns:cx7="http://schemas.microsoft.com/office/drawing/2016/5/13/chartex" xmlns:cx8="http://schemas.microsoft.com/office/drawing/2016/5/14/chartex" xmlns:mc="http://schemas.openxmlformats.org/markup-compatibility/2006" xmlns:aink="http://schemas.microsoft.com/office/drawing/2016/ink" xmlns:am3d="http://schemas.microsoft.com/office/drawing/2017/model3d" xmlns:o="urn:schemas-microsoft-com:office:office" xmlns:oel="http://schemas.microsoft.com/office/2019/extlst" xmlns:r="http://schemas.openxmlformats.org/officeDocument/2006/relationships" xmlns:m="http://schemas.openxmlformats.org/officeDocument/2006/math" xmlns:v="urn:schemas-microsoft-com:vml" xmlns:wp14="http://schemas.microsoft.com/office/word/2010/wordprocessingDrawing" xmlns:wp="http://schemas.openxmlformats.org/drawingml/2006/wordprocessingDrawing" xmlns:w10="urn:schemas-microsoft-com:office:word" xmlns:w="http://schemas.openxmlformats.org/wordprocessingml/2006/main" xmlns:w14="http://schemas.microsoft.com/office/word/2010/wordml" xmlns:w15="http://schemas.microsoft.com/office/word/2012/wordml" xmlns:w16cex="http://schemas.microsoft.com/office/word/2018/wordml/cex" xmlns:w16cid="http://schemas.microsoft.com/office/word/2016/wordml/cid" xmlns:w16="http://schemas.microsoft.com/office/word/2018/wordml" xmlns:w16du="http://schemas.microsoft.com/office/word/2023/wordml/word16du" xmlns:w16sdtdh="http://schemas.microsoft.com/office/word/2020/wordml/sdtdatahash" xmlns:w16sdtfl="http://schemas.microsoft.com/office/word/2024/wordml/sdtformatlock" xmlns:w16se="http://schemas.microsoft.com/office/word/2015/wordml/symex" xmlns:wpg="http://schemas.microsoft.com/office/word/2010/wordprocessingGroup" xmlns:wpi="http://schemas.microsoft.com/office/word/2010/wordprocessingInk" xmlns:wne="http://schemas.microsoft.com/office/word/2006/wordml" xmlns:wps="http://schemas.microsoft.com/office/word/2010/wordprocessingShape" mc:Ignorable="w14 w15 w16se w16cid w16 w16cex w16sdtdh w16sdtfl w16du wp14">
+  <w:p>
+    <w:pPr>
+      <w:spacing w:after="0" w:line="240" w:lineRule="auto"/>
+      <w:jc w:val="right"/>
+      <w:rPr>
+        <w:rFonts w:ascii="Arial Narrow" w:hAnsi="Arial Narrow"/>
+        <w:b/>
+        <w:bCs/>
+        <w:sz w:val="20"/>
+        <w:szCs w:val="20"/>
+      </w:rPr>
+    </w:pPr>
+    <w:r>
+      <w:rPr>
+        <w:noProof/>
+      </w:rPr>
+      <w:drawing>
+        <wp:anchor distT="0" distB="0" distL="114300" distR="114300" simplePos="0" relativeHeight="251658240" behindDoc="1" locked="0" layoutInCell="1" allowOverlap="1" wp14:anchorId="6C66E213" wp14:editId="0822BE41">
+          <wp:simplePos x="0" y="0"/>
+          <wp:positionH relativeFrom="column">
+            <wp:posOffset>-32385</wp:posOffset>
+          </wp:positionH>
+          <wp:positionV relativeFrom="paragraph">
+            <wp:posOffset>-20955</wp:posOffset>
+          </wp:positionV>
+          <wp:extent cx="1957705" cy="756920"/>
+          <wp:effectExtent l="0" t="0" r="0" b="0"/>
+          <wp:wrapNone/>
+          <wp:docPr id="4" name="Imagen 1" descr="C:\Users\ocruza\Desktop\Captura-removebg-preview.png"/>
+          <wp:cNvGraphicFramePr>
+            <a:graphicFrameLocks xmlns:a="http://schemas.openxmlformats.org/drawingml/2006/main" noChangeAspect="1"/>
+          </wp:cNvGraphicFramePr>
+          <a:graphic xmlns:a="http://schemas.openxmlformats.org/drawingml/2006/main">
+            <a:graphicData uri="http://schemas.openxmlformats.org/drawingml/2006/picture">
+              <pic:pic xmlns:pic="http://schemas.openxmlformats.org/drawingml/2006/picture">
+                <pic:nvPicPr>
+                  <pic:cNvPr id="4" name="Imagen 4" descr="C:\Users\ocruza\Desktop\Captura-removebg-preview.png"/>
+                  <pic:cNvPicPr>
+                    <a:picLocks noChangeAspect="1"/>
+                  </pic:cNvPicPr>
+                </pic:nvPicPr>
+                <pic:blipFill>
+                  <a:blip r:embed="rId1">
+                    <a:extLst>
+                      <a:ext uri="{28A0092B-C50C-407E-A947-70E740481C1C}">
+                        <a14:useLocalDpi xmlns:a14="http://schemas.microsoft.com/office/drawing/2010/main" val="0"/>
+                      </a:ext>
+                    </a:extLst>
+                  </a:blip>
+                  <a:srcRect/>
+                  <a:stretch>
+                    <a:fillRect/>
+                  </a:stretch>
+                </pic:blipFill>
+                <pic:spPr bwMode="auto">
+                  <a:xfrm>
+                    <a:off x="0" y="0"/>
+                    <a:ext cx="1957705" cy="756920"/>
+                  </a:xfrm>
+                  <a:prstGeom prst="rect">
+                    <a:avLst/>
+                  </a:prstGeom>
+                  <a:noFill/>
+                  <a:ln>
+                    <a:noFill/>
+                  </a:ln>
+                </pic:spPr>
+              </pic:pic>
+            </a:graphicData>
+          </a:graphic>
+          <wp14:sizeRelH relativeFrom="page">
+            <wp14:pctWidth>0</wp14:pctWidth>
+          </wp14:sizeRelH>
+          <wp14:sizeRelV relativeFrom="page">
+            <wp14:pctHeight>0</wp14:pctHeight>
+          </wp14:sizeRelV>
+        </wp:anchor>
+      </w:drawing>
+    </w:r>
+    <w:r>
+      <w:rPr>
+        <w:rFonts w:ascii="Arial Narrow" w:hAnsi="Arial Narrow"/>
+        <w:b/>
+        <w:bCs/>
+        <w:sz w:val="20"/>
+        <w:szCs w:val="20"/>
+      </w:rPr>
+      <w:t>FISCALÍA GENERAL DEL ESTADO DE GUANAJUATO</w:t>
+    </w:r>
+  </w:p>
+  <w:p>
+    <w:pPr>
+      <w:spacing w:after="0" w:line="240" w:lineRule="auto"/>
+      <w:jc w:val="right"/>
+      <w:rPr>
+        <w:rFonts w:ascii="Arial Narrow" w:hAnsi="Arial Narrow"/>
+        <w:b/>
+        <w:bCs/>
+        <w:sz w:val="20"/>
+        <w:szCs w:val="20"/>
+      </w:rPr>
+    </w:pPr>
+    <w:r>
+      <w:rPr>
+        <w:rFonts w:ascii="Arial Narrow" w:hAnsi="Arial Narrow"/>
+        <w:b/>
+        <w:bCs/>
+        <w:sz w:val="20"/>
+        <w:szCs w:val="20"/>
+      </w:rPr>
+      <w:t>Fiscalía Regional "B"</w:t>
+    </w:r>
+  </w:p>
+  <w:p>
+    <w:pPr>
+      <w:spacing w:after="0" w:line="240" w:lineRule="auto"/>
+      <w:jc w:val="right"/>
+      <w:rPr>
+        <w:rFonts w:ascii="Arial Narrow" w:hAnsi="Arial Narrow"/>
+        <w:b/>
+        <w:bCs/>
+        <w:sz w:val="20"/>
+        <w:szCs w:val="20"/>
+      </w:rPr>
+    </w:pPr>
+    <w:r>
+      <w:rPr>
+        <w:rFonts w:ascii="Arial Narrow" w:hAnsi="Arial Narrow"/>
+        <w:b/>
+        <w:bCs/>
+        <w:sz w:val="20"/>
+        <w:szCs w:val="20"/>
+      </w:rPr>
+      <w:t xml:space="preserve">Agencia del </w:t>
+    </w:r>
+    <w:r>
+      <w:rPr>
+        <w:rFonts w:ascii="Arial Narrow" w:hAnsi="Arial Narrow"/>
+        <w:b/>
+        <w:bCs/>
+        <w:sz w:val="20"/>
+        <w:szCs w:val="20"/>
+      </w:rPr>
+      <w:t>M</w:t>
+    </w:r>
+    <w:r>
+      <w:rPr>
+        <w:rFonts w:ascii="Arial Narrow" w:hAnsi="Arial Narrow"/>
+        <w:b/>
+        <w:bCs/>
+        <w:sz w:val="20"/>
+        <w:szCs w:val="20"/>
+      </w:rPr>
+      <w:t>inisterio P</w:t>
+    </w:r>
+    <w:r>
+      <w:rPr>
+        <w:rFonts w:ascii="Arial Narrow" w:hAnsi="Arial Narrow"/>
+        <w:b/>
+        <w:bCs/>
+        <w:sz w:val="20"/>
+        <w:szCs w:val="20"/>
+      </w:rPr>
+      <w:t>ú</w:t>
+    </w:r>
+    <w:r>
+      <w:rPr>
+        <w:rFonts w:ascii="Arial Narrow" w:hAnsi="Arial Narrow"/>
+        <w:b/>
+        <w:bCs/>
+        <w:sz w:val="20"/>
+        <w:szCs w:val="20"/>
+      </w:rPr>
+      <w:t xml:space="preserve">blico </w:t>
+    </w:r>
+    <w:r>
+      <w:rPr>
+        <w:rFonts w:ascii="Arial Narrow" w:hAnsi="Arial Narrow"/>
+        <w:b/>
+        <w:bCs/>
+        <w:sz w:val="20"/>
+        <w:szCs w:val="20"/>
+      </w:rPr>
+      <w:t>{{agencia}}</w:t>
+    </w:r>
+  </w:p>
+  <w:p>
+    <w:pPr>
+      <w:spacing w:after="0" w:line="240" w:lineRule="auto"/>
+      <w:jc w:val="right"/>
+      <w:rPr>
+        <w:rFonts w:ascii="Arial Narrow" w:hAnsi="Arial Narrow"/>
+        <w:b/>
+        <w:bCs/>
+        <w:sz w:val="20"/>
+        <w:szCs w:val="20"/>
+      </w:rPr>
+    </w:pPr>
+    <w:r>
+      <w:rPr>
+        <w:rFonts w:ascii="Arial Narrow" w:hAnsi="Arial Narrow"/>
+        <w:b/>
+        <w:bCs/>
+        <w:sz w:val="20"/>
+        <w:szCs w:val="20"/>
+      </w:rPr>
+      <w:t xml:space="preserve">Carpeta de Investigación: </w:t>
+    </w:r>
+    <w:r>
+      <w:rPr>
+        <w:rFonts w:ascii="Arial Narrow" w:hAnsi="Arial Narrow"/>
+        <w:b/>
+        <w:bCs/>
+        <w:sz w:val="20"/>
+        <w:szCs w:val="20"/>
+      </w:rPr>
+      <w:t>{{carpeta}}</w:t>
+    </w:r>
+  </w:p>
+  <w:p>
+    <w:pPr>
+      <w:spacing w:after="0" w:line="240" w:lineRule="auto"/>
+      <w:jc w:val="right"/>
+      <w:rPr>
+        <w:rFonts w:ascii="Arial Narrow" w:hAnsi="Arial Narrow"/>
+        <w:b/>
+        <w:bCs/>
+        <w:sz w:val="20"/>
+        <w:szCs w:val="20"/>
+      </w:rPr>
+    </w:pPr>
+    <w:r>
+      <w:rPr>
+        <w:rFonts w:ascii="Arial Narrow" w:hAnsi="Arial Narrow"/>
+        <w:b/>
+        <w:bCs/>
+        <w:sz w:val="20"/>
+        <w:szCs w:val="20"/>
+      </w:rPr>
+      <w:t xml:space="preserve">Oficio: </w:t>
+    </w:r>
+    <w:r>
+      <w:rPr>
+        <w:rFonts w:ascii="Arial Narrow" w:hAnsi="Arial Narrow"/>
+        <w:b/>
+        <w:bCs/>
+        <w:sz w:val="20"/>
+        <w:szCs w:val="20"/>
+        <w:highlight w:val="yellow"/>
+      </w:rPr>
+      <w:t>0001/2026</w:t>
+    </w:r>
+  </w:p>
+  <w:p>
+    <w:pPr>
+      <w:pStyle w:val="Encabezado"/>
+    </w:pPr>
+  </w:p>
+</w:hdr>
 </file>
 
 <file path=word/styles.xml><?xml version="1.0" encoding="utf-8"?>
@@ -442,7 +1073,7 @@
     <w:link w:val="Ttulo1Car"/>
     <w:uiPriority w:val="9"/>
     <w:qFormat/>
-    <w:rsid w:val="00E8688A"/>
+    <w:rsid w:val="001E3C71"/>
     <w:pPr>
       <w:keepNext/>
       <w:keepLines/>
@@ -465,7 +1096,7 @@
     <w:semiHidden/>
     <w:unhideWhenUsed/>
     <w:qFormat/>
-    <w:rsid w:val="00E8688A"/>
+    <w:rsid w:val="001E3C71"/>
     <w:pPr>
       <w:keepNext/>
       <w:keepLines/>
@@ -488,7 +1119,7 @@
     <w:semiHidden/>
     <w:unhideWhenUsed/>
     <w:qFormat/>
-    <w:rsid w:val="00E8688A"/>
+    <w:rsid w:val="001E3C71"/>
     <w:pPr>
       <w:keepNext/>
       <w:keepLines/>
@@ -511,7 +1142,7 @@
     <w:semiHidden/>
     <w:unhideWhenUsed/>
     <w:qFormat/>
-    <w:rsid w:val="00E8688A"/>
+    <w:rsid w:val="001E3C71"/>
     <w:pPr>
       <w:keepNext/>
       <w:keepLines/>
@@ -534,7 +1165,7 @@
     <w:semiHidden/>
     <w:unhideWhenUsed/>
     <w:qFormat/>
-    <w:rsid w:val="00E8688A"/>
+    <w:rsid w:val="001E3C71"/>
     <w:pPr>
       <w:keepNext/>
       <w:keepLines/>
@@ -555,7 +1186,7 @@
     <w:semiHidden/>
     <w:unhideWhenUsed/>
     <w:qFormat/>
-    <w:rsid w:val="00E8688A"/>
+    <w:rsid w:val="001E3C71"/>
     <w:pPr>
       <w:keepNext/>
       <w:keepLines/>
@@ -578,7 +1209,7 @@
     <w:semiHidden/>
     <w:unhideWhenUsed/>
     <w:qFormat/>
-    <w:rsid w:val="00E8688A"/>
+    <w:rsid w:val="001E3C71"/>
     <w:pPr>
       <w:keepNext/>
       <w:keepLines/>
@@ -599,7 +1230,7 @@
     <w:semiHidden/>
     <w:unhideWhenUsed/>
     <w:qFormat/>
-    <w:rsid w:val="00E8688A"/>
+    <w:rsid w:val="001E3C71"/>
     <w:pPr>
       <w:keepNext/>
       <w:keepLines/>
@@ -622,7 +1253,7 @@
     <w:semiHidden/>
     <w:unhideWhenUsed/>
     <w:qFormat/>
-    <w:rsid w:val="00E8688A"/>
+    <w:rsid w:val="001E3C71"/>
     <w:pPr>
       <w:keepNext/>
       <w:keepLines/>
@@ -666,7 +1297,7 @@
     <w:basedOn w:val="Fuentedeprrafopredeter"/>
     <w:link w:val="Ttulo1"/>
     <w:uiPriority w:val="9"/>
-    <w:rsid w:val="00E8688A"/>
+    <w:rsid w:val="001E3C71"/>
     <w:rPr>
       <w:rFonts w:asciiTheme="majorHAnsi" w:eastAsiaTheme="majorEastAsia" w:hAnsiTheme="majorHAnsi" w:cstheme="majorBidi"/>
       <w:color w:val="0F4761" w:themeColor="accent1" w:themeShade="BF"/>
@@ -680,7 +1311,7 @@
     <w:link w:val="Ttulo2"/>
     <w:uiPriority w:val="9"/>
     <w:semiHidden/>
-    <w:rsid w:val="00E8688A"/>
+    <w:rsid w:val="001E3C71"/>
     <w:rPr>
       <w:rFonts w:asciiTheme="majorHAnsi" w:eastAsiaTheme="majorEastAsia" w:hAnsiTheme="majorHAnsi" w:cstheme="majorBidi"/>
       <w:color w:val="0F4761" w:themeColor="accent1" w:themeShade="BF"/>
@@ -694,7 +1325,7 @@
     <w:link w:val="Ttulo3"/>
     <w:uiPriority w:val="9"/>
     <w:semiHidden/>
-    <w:rsid w:val="00E8688A"/>
+    <w:rsid w:val="001E3C71"/>
     <w:rPr>
       <w:rFonts w:eastAsiaTheme="majorEastAsia" w:cstheme="majorBidi"/>
       <w:color w:val="0F4761" w:themeColor="accent1" w:themeShade="BF"/>
@@ -708,7 +1339,7 @@
     <w:link w:val="Ttulo4"/>
     <w:uiPriority w:val="9"/>
     <w:semiHidden/>
-    <w:rsid w:val="00E8688A"/>
+    <w:rsid w:val="001E3C71"/>
     <w:rPr>
       <w:rFonts w:eastAsiaTheme="majorEastAsia" w:cstheme="majorBidi"/>
       <w:i/>
@@ -722,7 +1353,7 @@
     <w:link w:val="Ttulo5"/>
     <w:uiPriority w:val="9"/>
     <w:semiHidden/>
-    <w:rsid w:val="00E8688A"/>
+    <w:rsid w:val="001E3C71"/>
     <w:rPr>
       <w:rFonts w:eastAsiaTheme="majorEastAsia" w:cstheme="majorBidi"/>
       <w:color w:val="0F4761" w:themeColor="accent1" w:themeShade="BF"/>
@@ -734,7 +1365,7 @@
     <w:link w:val="Ttulo6"/>
     <w:uiPriority w:val="9"/>
     <w:semiHidden/>
-    <w:rsid w:val="00E8688A"/>
+    <w:rsid w:val="001E3C71"/>
     <w:rPr>
       <w:rFonts w:eastAsiaTheme="majorEastAsia" w:cstheme="majorBidi"/>
       <w:i/>
@@ -748,7 +1379,7 @@
     <w:link w:val="Ttulo7"/>
     <w:uiPriority w:val="9"/>
     <w:semiHidden/>
-    <w:rsid w:val="00E8688A"/>
+    <w:rsid w:val="001E3C71"/>
     <w:rPr>
       <w:rFonts w:eastAsiaTheme="majorEastAsia" w:cstheme="majorBidi"/>
       <w:color w:val="595959" w:themeColor="text1" w:themeTint="A6"/>
@@ -760,7 +1391,7 @@
     <w:link w:val="Ttulo8"/>
     <w:uiPriority w:val="9"/>
     <w:semiHidden/>
-    <w:rsid w:val="00E8688A"/>
+    <w:rsid w:val="001E3C71"/>
     <w:rPr>
       <w:rFonts w:eastAsiaTheme="majorEastAsia" w:cstheme="majorBidi"/>
       <w:i/>
@@ -774,7 +1405,7 @@
     <w:link w:val="Ttulo9"/>
     <w:uiPriority w:val="9"/>
     <w:semiHidden/>
-    <w:rsid w:val="00E8688A"/>
+    <w:rsid w:val="001E3C71"/>
     <w:rPr>
       <w:rFonts w:eastAsiaTheme="majorEastAsia" w:cstheme="majorBidi"/>
       <w:color w:val="272727" w:themeColor="text1" w:themeTint="D8"/>
@@ -787,7 +1418,7 @@
     <w:link w:val="TtuloCar"/>
     <w:uiPriority w:val="10"/>
     <w:qFormat/>
-    <w:rsid w:val="00E8688A"/>
+    <w:rsid w:val="001E3C71"/>
     <w:pPr>
       <w:spacing w:after="80" w:line="240" w:lineRule="auto"/>
       <w:contextualSpacing/>
@@ -805,7 +1436,7 @@
     <w:basedOn w:val="Fuentedeprrafopredeter"/>
     <w:link w:val="Ttulo"/>
     <w:uiPriority w:val="10"/>
-    <w:rsid w:val="00E8688A"/>
+    <w:rsid w:val="001E3C71"/>
     <w:rPr>
       <w:rFonts w:asciiTheme="majorHAnsi" w:eastAsiaTheme="majorEastAsia" w:hAnsiTheme="majorHAnsi" w:cstheme="majorBidi"/>
       <w:spacing w:val="-10"/>
@@ -821,7 +1452,7 @@
     <w:link w:val="SubttuloCar"/>
     <w:uiPriority w:val="11"/>
     <w:qFormat/>
-    <w:rsid w:val="00E8688A"/>
+    <w:rsid w:val="001E3C71"/>
     <w:pPr>
       <w:numPr>
         <w:ilvl w:val="1"/>
@@ -840,7 +1471,7 @@
     <w:basedOn w:val="Fuentedeprrafopredeter"/>
     <w:link w:val="Subttulo"/>
     <w:uiPriority w:val="11"/>
-    <w:rsid w:val="00E8688A"/>
+    <w:rsid w:val="001E3C71"/>
     <w:rPr>
       <w:rFonts w:eastAsiaTheme="majorEastAsia" w:cstheme="majorBidi"/>
       <w:color w:val="595959" w:themeColor="text1" w:themeTint="A6"/>
@@ -856,7 +1487,7 @@
     <w:link w:val="CitaCar"/>
     <w:uiPriority w:val="29"/>
     <w:qFormat/>
-    <w:rsid w:val="00E8688A"/>
+    <w:rsid w:val="001E3C71"/>
     <w:pPr>
       <w:spacing w:before="160"/>
       <w:jc w:val="center"/>
@@ -872,7 +1503,7 @@
     <w:basedOn w:val="Fuentedeprrafopredeter"/>
     <w:link w:val="Cita"/>
     <w:uiPriority w:val="29"/>
-    <w:rsid w:val="00E8688A"/>
+    <w:rsid w:val="001E3C71"/>
     <w:rPr>
       <w:i/>
       <w:iCs/>
@@ -884,7 +1515,7 @@
     <w:basedOn w:val="Normal"/>
     <w:uiPriority w:val="34"/>
     <w:qFormat/>
-    <w:rsid w:val="00E8688A"/>
+    <w:rsid w:val="001E3C71"/>
     <w:pPr>
       <w:ind w:left="720"/>
       <w:contextualSpacing/>
@@ -895,7 +1526,7 @@
     <w:basedOn w:val="Fuentedeprrafopredeter"/>
     <w:uiPriority w:val="21"/>
     <w:qFormat/>
-    <w:rsid w:val="00E8688A"/>
+    <w:rsid w:val="001E3C71"/>
     <w:rPr>
       <w:i/>
       <w:iCs/>
@@ -909,7 +1540,7 @@
     <w:link w:val="CitadestacadaCar"/>
     <w:uiPriority w:val="30"/>
     <w:qFormat/>
-    <w:rsid w:val="00E8688A"/>
+    <w:rsid w:val="001E3C71"/>
     <w:pPr>
       <w:pBdr>
         <w:top w:val="single" w:sz="4" w:space="10" w:color="0F4761" w:themeColor="accent1" w:themeShade="BF"/>
@@ -930,7 +1561,7 @@
     <w:basedOn w:val="Fuentedeprrafopredeter"/>
     <w:link w:val="Citadestacada"/>
     <w:uiPriority w:val="30"/>
-    <w:rsid w:val="00E8688A"/>
+    <w:rsid w:val="001E3C71"/>
     <w:rPr>
       <w:i/>
       <w:iCs/>
@@ -942,7 +1573,7 @@
     <w:basedOn w:val="Fuentedeprrafopredeter"/>
     <w:uiPriority w:val="32"/>
     <w:qFormat/>
-    <w:rsid w:val="00E8688A"/>
+    <w:rsid w:val="001E3C71"/>
     <w:rPr>
       <w:b/>
       <w:bCs/>
@@ -951,7 +1582,622 @@
       <w:spacing w:val="5"/>
     </w:rPr>
   </w:style>
+  <w:style w:type="paragraph" w:styleId="Encabezado">
+    <w:name w:val="header"/>
+    <w:basedOn w:val="Normal"/>
+    <w:link w:val="EncabezadoCar"/>
+    <w:uiPriority w:val="99"/>
+    <w:unhideWhenUsed/>
+    <w:rsid w:val="001E3C71"/>
+    <w:pPr>
+      <w:tabs>
+        <w:tab w:val="center" w:pos="4419"/>
+        <w:tab w:val="right" w:pos="8838"/>
+      </w:tabs>
+      <w:spacing w:after="0" w:line="240" w:lineRule="auto"/>
+    </w:pPr>
+  </w:style>
+  <w:style w:type="character" w:customStyle="1" w:styleId="EncabezadoCar">
+    <w:name w:val="Encabezado Car"/>
+    <w:basedOn w:val="Fuentedeprrafopredeter"/>
+    <w:link w:val="Encabezado"/>
+    <w:uiPriority w:val="99"/>
+    <w:rsid w:val="001E3C71"/>
+  </w:style>
+  <w:style w:type="paragraph" w:styleId="Piedepgina">
+    <w:name w:val="footer"/>
+    <w:basedOn w:val="Normal"/>
+    <w:link w:val="PiedepginaCar"/>
+    <w:uiPriority w:val="99"/>
+    <w:unhideWhenUsed/>
+    <w:rsid w:val="001E3C71"/>
+    <w:pPr>
+      <w:tabs>
+        <w:tab w:val="center" w:pos="4419"/>
+        <w:tab w:val="right" w:pos="8838"/>
+      </w:tabs>
+      <w:spacing w:after="0" w:line="240" w:lineRule="auto"/>
+    </w:pPr>
+  </w:style>
+  <w:style w:type="character" w:customStyle="1" w:styleId="PiedepginaCar">
+    <w:name w:val="Pie de página Car"/>
+    <w:basedOn w:val="Fuentedeprrafopredeter"/>
+    <w:link w:val="Piedepgina"/>
+    <w:uiPriority w:val="99"/>
+    <w:rsid w:val="001E3C71"/>
+  </w:style>
+  <w:style w:type="character" w:styleId="Textodelmarcadordeposicin">
+    <w:name w:val="Placeholder Text"/>
+    <w:basedOn w:val="Fuentedeprrafopredeter"/>
+    <w:uiPriority w:val="99"/>
+    <w:semiHidden/>
+    <w:rsid w:val="001E3C71"/>
+    <w:rPr>
+      <w:color w:val="666666"/>
+    </w:rPr>
+  </w:style>
 </w:styles>
+</file>
+
+<file path=word/glossary/document.xml><?xml version="1.0" encoding="utf-8"?>
+<w:glossaryDocument xmlns:wpc="http://schemas.microsoft.com/office/word/2010/wordprocessingCanvas" xmlns:cx="http://schemas.microsoft.com/office/drawing/2014/chartex" xmlns:cx1="http://schemas.microsoft.com/office/drawing/2015/9/8/chartex" xmlns:cx2="http://schemas.microsoft.com/office/drawing/2015/10/21/chartex" xmlns:cx3="http://schemas.microsoft.com/office/drawing/2016/5/9/chartex" xmlns:cx4="http://schemas.microsoft.com/office/drawing/2016/5/10/chartex" xmlns:cx5="http://schemas.microsoft.com/office/drawing/2016/5/11/chartex" xmlns:cx6="http://schemas.microsoft.com/office/drawing/2016/5/12/chartex" xmlns:cx7="http://schemas.microsoft.com/office/drawing/2016/5/13/chartex" xmlns:cx8="http://schemas.microsoft.com/office/drawing/2016/5/14/chartex" xmlns:mc="http://schemas.openxmlformats.org/markup-compatibility/2006" xmlns:aink="http://schemas.microsoft.com/office/drawing/2016/ink" xmlns:am3d="http://schemas.microsoft.com/office/drawing/2017/model3d" xmlns:o="urn:schemas-microsoft-com:office:office" xmlns:oel="http://schemas.microsoft.com/office/2019/extlst" xmlns:r="http://schemas.openxmlformats.org/officeDocument/2006/relationships" xmlns:m="http://schemas.openxmlformats.org/officeDocument/2006/math" xmlns:v="urn:schemas-microsoft-com:vml" xmlns:wp14="http://schemas.microsoft.com/office/word/2010/wordprocessingDrawing" xmlns:wp="http://schemas.openxmlformats.org/drawingml/2006/wordprocessingDrawing" xmlns:w10="urn:schemas-microsoft-com:office:word" xmlns:w="http://schemas.openxmlformats.org/wordprocessingml/2006/main" xmlns:w14="http://schemas.microsoft.com/office/word/2010/wordml" xmlns:w15="http://schemas.microsoft.com/office/word/2012/wordml" xmlns:w16cex="http://schemas.microsoft.com/office/word/2018/wordml/cex" xmlns:w16cid="http://schemas.microsoft.com/office/word/2016/wordml/cid" xmlns:w16="http://schemas.microsoft.com/office/word/2018/wordml" xmlns:w16du="http://schemas.microsoft.com/office/word/2023/wordml/word16du" xmlns:w16sdtdh="http://schemas.microsoft.com/office/word/2020/wordml/sdtdatahash" xmlns:w16sdtfl="http://schemas.microsoft.com/office/word/2024/wordml/sdtformatlock" xmlns:w16se="http://schemas.microsoft.com/office/word/2015/wordml/symex" xmlns:wpg="http://schemas.microsoft.com/office/word/2010/wordprocessingGroup" xmlns:wpi="http://schemas.microsoft.com/office/word/2010/wordprocessingInk" xmlns:wne="http://schemas.microsoft.com/office/word/2006/wordml" xmlns:wps="http://schemas.microsoft.com/office/word/2010/wordprocessingShape" mc:Ignorable="w14 w15 w16se w16cid w16 w16cex w16sdtdh w16sdtfl w16du wp14">
+  <w:docParts>
+    <w:docPart>
+      <w:docPartPr>
+        <w:name w:val="DefaultPlaceholder_-1854013437"/>
+        <w:category>
+          <w:name w:val="General"/>
+          <w:gallery w:val="placeholder"/>
+        </w:category>
+        <w:types>
+          <w:type w:val="bbPlcHdr"/>
+        </w:types>
+        <w:behaviors>
+          <w:behavior w:val="content"/>
+        </w:behaviors>
+        <w:guid w:val="{2B429C65-25AE-418E-9C2D-A0C3E7DF2207}"/>
+      </w:docPartPr>
+      <w:docPartBody>
+        <w:p>
+          <w:r>
+            <w:rPr>
+              <w:rStyle w:val="Textodelmarcadordeposicin"/>
+            </w:rPr>
+            <w:t>Haga clic aquí o pulse para escribir una fecha.</w:t>
+          </w:r>
+        </w:p>
+      </w:docPartBody>
+    </w:docPart>
+  </w:docParts>
+</w:glossaryDocument>
+</file>
+
+<file path=word/glossary/fontTable.xml><?xml version="1.0" encoding="utf-8"?>
+<w:fonts xmlns:mc="http://schemas.openxmlformats.org/markup-compatibility/2006" xmlns:r="http://schemas.openxmlformats.org/officeDocument/2006/relationships" xmlns:w="http://schemas.openxmlformats.org/wordprocessingml/2006/main" xmlns:w14="http://schemas.microsoft.com/office/word/2010/wordml" xmlns:w15="http://schemas.microsoft.com/office/word/2012/wordml" xmlns:w16cex="http://schemas.microsoft.com/office/word/2018/wordml/cex" xmlns:w16cid="http://schemas.microsoft.com/office/word/2016/wordml/cid" xmlns:w16="http://schemas.microsoft.com/office/word/2018/wordml" xmlns:w16du="http://schemas.microsoft.com/office/word/2023/wordml/word16du" xmlns:w16sdtdh="http://schemas.microsoft.com/office/word/2020/wordml/sdtdatahash" xmlns:w16sdtfl="http://schemas.microsoft.com/office/word/2024/wordml/sdtformatlock" xmlns:w16se="http://schemas.microsoft.com/office/word/2015/wordml/symex" mc:Ignorable="w14 w15 w16se w16cid w16 w16cex w16sdtdh w16sdtfl w16du">
+  <w:font w:name="Aptos">
+    <w:charset w:val="00"/>
+    <w:family w:val="swiss"/>
+    <w:pitch w:val="variable"/>
+    <w:sig w:usb0="20000287" w:usb1="00000003" w:usb2="00000000" w:usb3="00000000" w:csb0="0000019F" w:csb1="00000000"/>
+  </w:font>
+  <w:font w:name="Times New Roman">
+    <w:panose1 w:val="02020603050405020304"/>
+    <w:charset w:val="00"/>
+    <w:family w:val="roman"/>
+    <w:pitch w:val="variable"/>
+    <w:sig w:usb0="E0002EFF" w:usb1="C000785B" w:usb2="00000009" w:usb3="00000000" w:csb0="000001FF" w:csb1="00000000"/>
+  </w:font>
+  <w:font w:name="Aptos Display">
+    <w:charset w:val="00"/>
+    <w:family w:val="swiss"/>
+    <w:pitch w:val="variable"/>
+    <w:sig w:usb0="20000287" w:usb1="00000003" w:usb2="00000000" w:usb3="00000000" w:csb0="0000019F" w:csb1="00000000"/>
+  </w:font>
+  <w:font w:name="Arial Narrow">
+    <w:panose1 w:val="020B0606020202030204"/>
+    <w:charset w:val="00"/>
+    <w:family w:val="swiss"/>
+    <w:pitch w:val="variable"/>
+    <w:sig w:usb0="00000287" w:usb1="00000800" w:usb2="00000000" w:usb3="00000000" w:csb0="0000009F" w:csb1="00000000"/>
+  </w:font>
+</w:fonts>
+</file>
+
+<file path=word/glossary/settings.xml><?xml version="1.0" encoding="utf-8"?>
+<w:settings xmlns:mc="http://schemas.openxmlformats.org/markup-compatibility/2006" xmlns:o="urn:schemas-microsoft-com:office:office" xmlns:r="http://schemas.openxmlformats.org/officeDocument/2006/relationships" xmlns:m="http://schemas.openxmlformats.org/officeDocument/2006/math" xmlns:v="urn:schemas-microsoft-com:vml" xmlns:w10="urn:schemas-microsoft-com:office:word" xmlns:w="http://schemas.openxmlformats.org/wordprocessingml/2006/main" xmlns:w14="http://schemas.microsoft.com/office/word/2010/wordml" xmlns:w15="http://schemas.microsoft.com/office/word/2012/wordml" xmlns:w16cex="http://schemas.microsoft.com/office/word/2018/wordml/cex" xmlns:w16cid="http://schemas.microsoft.com/office/word/2016/wordml/cid" xmlns:w16="http://schemas.microsoft.com/office/word/2018/wordml" xmlns:w16du="http://schemas.microsoft.com/office/word/2023/wordml/word16du" xmlns:w16sdtdh="http://schemas.microsoft.com/office/word/2020/wordml/sdtdatahash" xmlns:w16sdtfl="http://schemas.microsoft.com/office/word/2024/wordml/sdtformatlock" xmlns:w16se="http://schemas.microsoft.com/office/word/2015/wordml/symex" xmlns:sl="http://schemas.openxmlformats.org/schemaLibrary/2006/main" mc:Ignorable="w14 w15 w16se w16cid w16 w16cex w16sdtdh w16sdtfl w16du">
+  <w:view w:val="normal"/>
+  <w:defaultTabStop w:val="708"/>
+  <w:hyphenationZone w:val="425"/>
+  <w:characterSpacingControl w:val="doNotCompress"/>
+  <w:compat>
+    <w:useFELayout/>
+    <w:compatSetting w:name="compatibilityMode" w:uri="http://schemas.microsoft.com/office/word" w:val="15"/>
+    <w:compatSetting w:name="overrideTableStyleFontSizeAndJustification" w:uri="http://schemas.microsoft.com/office/word" w:val="1"/>
+    <w:compatSetting w:name="enableOpenTypeFeatures" w:uri="http://schemas.microsoft.com/office/word" w:val="1"/>
+    <w:compatSetting w:name="doNotFlipMirrorIndents" w:uri="http://schemas.microsoft.com/office/word" w:val="1"/>
+    <w:compatSetting w:name="differentiateMultirowTableHeaders" w:uri="http://schemas.microsoft.com/office/word" w:val="1"/>
+    <w:compatSetting w:name="useWord2013TrackBottomHyphenation" w:uri="http://schemas.microsoft.com/office/word" w:val="0"/>
+  </w:compat>
+  <w:rsids>
+    <w:rsidRoot w:val="009E101F"/>
+    <w:rsid w:val="00455854"/>
+    <w:rsid w:val="004F100D"/>
+    <w:rsid w:val="00520EFE"/>
+    <w:rsid w:val="005A46A7"/>
+    <w:rsid w:val="009309E8"/>
+    <w:rsid w:val="009E101F"/>
+    <w:rsid w:val="00A17D32"/>
+    <w:rsid w:val="00B441DF"/>
+    <w:rsid w:val="00BF437E"/>
+    <w:rsid w:val="00D804DF"/>
+  </w:rsids>
+  <m:mathPr>
+    <m:mathFont m:val="Cambria Math"/>
+    <m:brkBin m:val="before"/>
+    <m:brkBinSub m:val="--"/>
+    <m:smallFrac m:val="0"/>
+    <m:dispDef/>
+    <m:lMargin m:val="0"/>
+    <m:rMargin m:val="0"/>
+    <m:defJc m:val="centerGroup"/>
+    <m:wrapIndent m:val="1440"/>
+    <m:intLim m:val="subSup"/>
+    <m:naryLim m:val="undOvr"/>
+  </m:mathPr>
+  <w:themeFontLang w:val="es-MX"/>
+  <w:clrSchemeMapping w:bg1="light1" w:t1="dark1" w:bg2="light2" w:t2="dark2" w:accent1="accent1" w:accent2="accent2" w:accent3="accent3" w:accent4="accent4" w:accent5="accent5" w:accent6="accent6" w:hyperlink="hyperlink" w:followedHyperlink="followedHyperlink"/>
+  <w:decimalSymbol w:val="."/>
+  <w:listSeparator w:val=","/>
+  <w15:chartTrackingRefBased/>
+</w:settings>
+</file>
+
+<file path=word/glossary/styles.xml><?xml version="1.0" encoding="utf-8"?>
+<w:styles xmlns:mc="http://schemas.openxmlformats.org/markup-compatibility/2006" xmlns:r="http://schemas.openxmlformats.org/officeDocument/2006/relationships" xmlns:w="http://schemas.openxmlformats.org/wordprocessingml/2006/main" xmlns:w14="http://schemas.microsoft.com/office/word/2010/wordml" xmlns:w15="http://schemas.microsoft.com/office/word/2012/wordml" xmlns:w16cex="http://schemas.microsoft.com/office/word/2018/wordml/cex" xmlns:w16cid="http://schemas.microsoft.com/office/word/2016/wordml/cid" xmlns:w16="http://schemas.microsoft.com/office/word/2018/wordml" xmlns:w16du="http://schemas.microsoft.com/office/word/2023/wordml/word16du" xmlns:w16sdtdh="http://schemas.microsoft.com/office/word/2020/wordml/sdtdatahash" xmlns:w16sdtfl="http://schemas.microsoft.com/office/word/2024/wordml/sdtformatlock" xmlns:w16se="http://schemas.microsoft.com/office/word/2015/wordml/symex" mc:Ignorable="w14 w15 w16se w16cid w16 w16cex w16sdtdh w16sdtfl w16du">
+  <w:docDefaults>
+    <w:rPrDefault>
+      <w:rPr>
+        <w:rFonts w:asciiTheme="minorHAnsi" w:eastAsiaTheme="minorEastAsia" w:hAnsiTheme="minorHAnsi" w:cstheme="minorBidi"/>
+        <w:kern w:val="2"/>
+        <w:sz w:val="24"/>
+        <w:szCs w:val="24"/>
+        <w:lang w:val="es-MX" w:eastAsia="es-MX" w:bidi="ar-SA"/>
+        <w14:ligatures w14:val="standardContextual"/>
+      </w:rPr>
+    </w:rPrDefault>
+    <w:pPrDefault>
+      <w:pPr>
+        <w:spacing w:after="160" w:line="278" w:lineRule="auto"/>
+      </w:pPr>
+    </w:pPrDefault>
+  </w:docDefaults>
+  <w:latentStyles w:defLockedState="0" w:defUIPriority="99" w:defSemiHidden="0" w:defUnhideWhenUsed="0" w:defQFormat="0" w:count="376">
+    <w:lsdException w:name="Normal" w:uiPriority="0" w:qFormat="1"/>
+    <w:lsdException w:name="heading 1" w:uiPriority="9" w:qFormat="1"/>
+    <w:lsdException w:name="heading 2" w:semiHidden="1" w:uiPriority="9" w:unhideWhenUsed="1" w:qFormat="1"/>
+    <w:lsdException w:name="heading 3" w:semiHidden="1" w:uiPriority="9" w:unhideWhenUsed="1" w:qFormat="1"/>
+    <w:lsdException w:name="heading 4" w:semiHidden="1" w:uiPriority="9" w:unhideWhenUsed="1" w:qFormat="1"/>
+    <w:lsdException w:name="heading 5" w:semiHidden="1" w:uiPriority="9" w:unhideWhenUsed="1" w:qFormat="1"/>
+    <w:lsdException w:name="heading 6" w:semiHidden="1" w:uiPriority="9" w:unhideWhenUsed="1" w:qFormat="1"/>
+    <w:lsdException w:name="heading 7" w:semiHidden="1" w:uiPriority="9" w:unhideWhenUsed="1" w:qFormat="1"/>
+    <w:lsdException w:name="heading 8" w:semiHidden="1" w:uiPriority="9" w:unhideWhenUsed="1" w:qFormat="1"/>
+    <w:lsdException w:name="heading 9" w:semiHidden="1" w:uiPriority="9" w:unhideWhenUsed="1" w:qFormat="1"/>
+    <w:lsdException w:name="index 1" w:semiHidden="1" w:unhideWhenUsed="1"/>
+    <w:lsdException w:name="index 2" w:semiHidden="1" w:unhideWhenUsed="1"/>
+    <w:lsdException w:name="index 3" w:semiHidden="1" w:unhideWhenUsed="1"/>
+    <w:lsdException w:name="index 4" w:semiHidden="1" w:unhideWhenUsed="1"/>
+    <w:lsdException w:name="index 5" w:semiHidden="1" w:unhideWhenUsed="1"/>
+    <w:lsdException w:name="index 6" w:semiHidden="1" w:unhideWhenUsed="1"/>
+    <w:lsdException w:name="index 7" w:semiHidden="1" w:unhideWhenUsed="1"/>
+    <w:lsdException w:name="index 8" w:semiHidden="1" w:unhideWhenUsed="1"/>
+    <w:lsdException w:name="index 9" w:semiHidden="1" w:unhideWhenUsed="1"/>
+    <w:lsdException w:name="toc 1" w:semiHidden="1" w:uiPriority="39" w:unhideWhenUsed="1"/>
+    <w:lsdException w:name="toc 2" w:semiHidden="1" w:uiPriority="39" w:unhideWhenUsed="1"/>
+    <w:lsdException w:name="toc 3" w:semiHidden="1" w:uiPriority="39" w:unhideWhenUsed="1"/>
+    <w:lsdException w:name="toc 4" w:semiHidden="1" w:uiPriority="39" w:unhideWhenUsed="1"/>
+    <w:lsdException w:name="toc 5" w:semiHidden="1" w:uiPriority="39" w:unhideWhenUsed="1"/>
+    <w:lsdException w:name="toc 6" w:semiHidden="1" w:uiPriority="39" w:unhideWhenUsed="1"/>
+    <w:lsdException w:name="toc 7" w:semiHidden="1" w:uiPriority="39" w:unhideWhenUsed="1"/>
+    <w:lsdException w:name="toc 8" w:semiHidden="1" w:uiPriority="39" w:unhideWhenUsed="1"/>
+    <w:lsdException w:name="toc 9" w:semiHidden="1" w:uiPriority="39" w:unhideWhenUsed="1"/>
+    <w:lsdException w:name="Normal Indent" w:semiHidden="1" w:unhideWhenUsed="1"/>
+    <w:lsdException w:name="footnote text" w:semiHidden="1" w:unhideWhenUsed="1"/>
+    <w:lsdException w:name="annotation text" w:semiHidden="1" w:unhideWhenUsed="1"/>
+    <w:lsdException w:name="header" w:semiHidden="1" w:unhideWhenUsed="1"/>
+    <w:lsdException w:name="footer" w:semiHidden="1" w:unhideWhenUsed="1"/>
+    <w:lsdException w:name="index heading" w:semiHidden="1" w:unhideWhenUsed="1"/>
+    <w:lsdException w:name="caption" w:semiHidden="1" w:uiPriority="35" w:unhideWhenUsed="1" w:qFormat="1"/>
+    <w:lsdException w:name="table of figures" w:semiHidden="1" w:unhideWhenUsed="1"/>
+    <w:lsdException w:name="envelope address" w:semiHidden="1" w:unhideWhenUsed="1"/>
+    <w:lsdException w:name="envelope return" w:semiHidden="1" w:unhideWhenUsed="1"/>
+    <w:lsdException w:name="footnote reference" w:semiHidden="1" w:unhideWhenUsed="1"/>
+    <w:lsdException w:name="annotation reference" w:semiHidden="1" w:unhideWhenUsed="1"/>
+    <w:lsdException w:name="line number" w:semiHidden="1" w:unhideWhenUsed="1"/>
+    <w:lsdException w:name="page number" w:semiHidden="1" w:unhideWhenUsed="1"/>
+    <w:lsdException w:name="endnote reference" w:semiHidden="1" w:unhideWhenUsed="1"/>
+    <w:lsdException w:name="endnote text" w:semiHidden="1" w:unhideWhenUsed="1"/>
+    <w:lsdException w:name="table of authorities" w:semiHidden="1" w:unhideWhenUsed="1"/>
+    <w:lsdException w:name="macro" w:semiHidden="1" w:unhideWhenUsed="1"/>
+    <w:lsdException w:name="toa heading" w:semiHidden="1" w:unhideWhenUsed="1"/>
+    <w:lsdException w:name="List" w:semiHidden="1" w:unhideWhenUsed="1"/>
+    <w:lsdException w:name="List Bullet" w:semiHidden="1" w:unhideWhenUsed="1"/>
+    <w:lsdException w:name="List Number" w:semiHidden="1" w:unhideWhenUsed="1"/>
+    <w:lsdException w:name="List 2" w:semiHidden="1" w:unhideWhenUsed="1"/>
+    <w:lsdException w:name="List 3" w:semiHidden="1" w:unhideWhenUsed="1"/>
+    <w:lsdException w:name="List 4" w:semiHidden="1" w:unhideWhenUsed="1"/>
+    <w:lsdException w:name="List 5" w:semiHidden="1" w:unhideWhenUsed="1"/>
+    <w:lsdException w:name="List Bullet 2" w:semiHidden="1" w:unhideWhenUsed="1"/>
+    <w:lsdException w:name="List Bullet 3" w:semiHidden="1" w:unhideWhenUsed="1"/>
+    <w:lsdException w:name="List Bullet 4" w:semiHidden="1" w:unhideWhenUsed="1"/>
+    <w:lsdException w:name="List Bullet 5" w:semiHidden="1" w:unhideWhenUsed="1"/>
+    <w:lsdException w:name="List Number 2" w:semiHidden="1" w:unhideWhenUsed="1"/>
+    <w:lsdException w:name="List Number 3" w:semiHidden="1" w:unhideWhenUsed="1"/>
+    <w:lsdException w:name="List Number 4" w:semiHidden="1" w:unhideWhenUsed="1"/>
+    <w:lsdException w:name="List Number 5" w:semiHidden="1" w:unhideWhenUsed="1"/>
+    <w:lsdException w:name="Title" w:uiPriority="10" w:qFormat="1"/>
+    <w:lsdException w:name="Closing" w:semiHidden="1" w:unhideWhenUsed="1"/>
+    <w:lsdException w:name="Signature" w:semiHidden="1" w:unhideWhenUsed="1"/>
+    <w:lsdException w:name="Default Paragraph Font" w:semiHidden="1" w:uiPriority="1" w:unhideWhenUsed="1"/>
+    <w:lsdException w:name="Body Text" w:semiHidden="1" w:unhideWhenUsed="1"/>
+    <w:lsdException w:name="Body Text Indent" w:semiHidden="1" w:unhideWhenUsed="1"/>
+    <w:lsdException w:name="List Continue" w:semiHidden="1" w:unhideWhenUsed="1"/>
+    <w:lsdException w:name="List Continue 2" w:semiHidden="1" w:unhideWhenUsed="1"/>
+    <w:lsdException w:name="List Continue 3" w:semiHidden="1" w:unhideWhenUsed="1"/>
+    <w:lsdException w:name="List Continue 4" w:semiHidden="1" w:unhideWhenUsed="1"/>
+    <w:lsdException w:name="List Continue 5" w:semiHidden="1" w:unhideWhenUsed="1"/>
+    <w:lsdException w:name="Message Header" w:semiHidden="1" w:unhideWhenUsed="1"/>
+    <w:lsdException w:name="Subtitle" w:uiPriority="11" w:qFormat="1"/>
+    <w:lsdException w:name="Salutation" w:semiHidden="1" w:unhideWhenUsed="1"/>
+    <w:lsdException w:name="Date" w:semiHidden="1" w:unhideWhenUsed="1"/>
+    <w:lsdException w:name="Body Text First Indent" w:semiHidden="1" w:unhideWhenUsed="1"/>
+    <w:lsdException w:name="Body Text First Indent 2" w:semiHidden="1" w:unhideWhenUsed="1"/>
+    <w:lsdException w:name="Note Heading" w:semiHidden="1" w:unhideWhenUsed="1"/>
+    <w:lsdException w:name="Body Text 2" w:semiHidden="1" w:unhideWhenUsed="1"/>
+    <w:lsdException w:name="Body Text 3" w:semiHidden="1" w:unhideWhenUsed="1"/>
+    <w:lsdException w:name="Body Text Indent 2" w:semiHidden="1" w:unhideWhenUsed="1"/>
+    <w:lsdException w:name="Body Text Indent 3" w:semiHidden="1" w:unhideWhenUsed="1"/>
+    <w:lsdException w:name="Block Text" w:semiHidden="1" w:unhideWhenUsed="1"/>
+    <w:lsdException w:name="Hyperlink" w:semiHidden="1" w:unhideWhenUsed="1"/>
+    <w:lsdException w:name="FollowedHyperlink" w:semiHidden="1" w:unhideWhenUsed="1"/>
+    <w:lsdException w:name="Strong" w:uiPriority="22" w:qFormat="1"/>
+    <w:lsdException w:name="Emphasis" w:uiPriority="20" w:qFormat="1"/>
+    <w:lsdException w:name="Document Map" w:semiHidden="1" w:unhideWhenUsed="1"/>
+    <w:lsdException w:name="Plain Text" w:semiHidden="1" w:unhideWhenUsed="1"/>
+    <w:lsdException w:name="E-mail Signature" w:semiHidden="1" w:unhideWhenUsed="1"/>
+    <w:lsdException w:name="HTML Top of Form" w:semiHidden="1" w:unhideWhenUsed="1"/>
+    <w:lsdException w:name="HTML Bottom of Form" w:semiHidden="1" w:unhideWhenUsed="1"/>
+    <w:lsdException w:name="Normal (Web)" w:semiHidden="1" w:unhideWhenUsed="1"/>
+    <w:lsdException w:name="HTML Acronym" w:semiHidden="1" w:unhideWhenUsed="1"/>
+    <w:lsdException w:name="HTML Address" w:semiHidden="1" w:unhideWhenUsed="1"/>
+    <w:lsdException w:name="HTML Cite" w:semiHidden="1" w:unhideWhenUsed="1"/>
+    <w:lsdException w:name="HTML Code" w:semiHidden="1" w:unhideWhenUsed="1"/>
+    <w:lsdException w:name="HTML Definition" w:semiHidden="1" w:unhideWhenUsed="1"/>
+    <w:lsdException w:name="HTML Keyboard" w:semiHidden="1" w:unhideWhenUsed="1"/>
+    <w:lsdException w:name="HTML Preformatted" w:semiHidden="1" w:unhideWhenUsed="1"/>
+    <w:lsdException w:name="HTML Sample" w:semiHidden="1" w:unhideWhenUsed="1"/>
+    <w:lsdException w:name="HTML Typewriter" w:semiHidden="1" w:unhideWhenUsed="1"/>
+    <w:lsdException w:name="HTML Variable" w:semiHidden="1" w:unhideWhenUsed="1"/>
+    <w:lsdException w:name="Normal Table" w:semiHidden="1" w:unhideWhenUsed="1"/>
+    <w:lsdException w:name="annotation subject" w:semiHidden="1" w:unhideWhenUsed="1"/>
+    <w:lsdException w:name="No List" w:semiHidden="1" w:unhideWhenUsed="1"/>
+    <w:lsdException w:name="Outline List 1" w:semiHidden="1" w:unhideWhenUsed="1"/>
+    <w:lsdException w:name="Outline List 2" w:semiHidden="1" w:unhideWhenUsed="1"/>
+    <w:lsdException w:name="Outline List 3" w:semiHidden="1" w:unhideWhenUsed="1"/>
+    <w:lsdException w:name="Table Simple 1" w:semiHidden="1" w:unhideWhenUsed="1"/>
+    <w:lsdException w:name="Table Simple 2" w:semiHidden="1" w:unhideWhenUsed="1"/>
+    <w:lsdException w:name="Table Simple 3" w:semiHidden="1" w:unhideWhenUsed="1"/>
+    <w:lsdException w:name="Table Classic 1" w:semiHidden="1" w:unhideWhenUsed="1"/>
+    <w:lsdException w:name="Table Classic 2" w:semiHidden="1" w:unhideWhenUsed="1"/>
+    <w:lsdException w:name="Table Classic 3" w:semiHidden="1" w:unhideWhenUsed="1"/>
+    <w:lsdException w:name="Table Classic 4" w:semiHidden="1" w:unhideWhenUsed="1"/>
+    <w:lsdException w:name="Table Colorful 1" w:semiHidden="1" w:unhideWhenUsed="1"/>
+    <w:lsdException w:name="Table Colorful 2" w:semiHidden="1" w:unhideWhenUsed="1"/>
+    <w:lsdException w:name="Table Colorful 3" w:semiHidden="1" w:unhideWhenUsed="1"/>
+    <w:lsdException w:name="Table Columns 1" w:semiHidden="1" w:unhideWhenUsed="1"/>
+    <w:lsdException w:name="Table Columns 2" w:semiHidden="1" w:unhideWhenUsed="1"/>
+    <w:lsdException w:name="Table Columns 3" w:semiHidden="1" w:unhideWhenUsed="1"/>
+    <w:lsdException w:name="Table Columns 4" w:semiHidden="1" w:unhideWhenUsed="1"/>
+    <w:lsdException w:name="Table Columns 5" w:semiHidden="1" w:unhideWhenUsed="1"/>
+    <w:lsdException w:name="Table Grid 1" w:semiHidden="1" w:unhideWhenUsed="1"/>
+    <w:lsdException w:name="Table Grid 2" w:semiHidden="1" w:unhideWhenUsed="1"/>
+    <w:lsdException w:name="Table Grid 3" w:semiHidden="1" w:unhideWhenUsed="1"/>
+    <w:lsdException w:name="Table Grid 4" w:semiHidden="1" w:unhideWhenUsed="1"/>
+    <w:lsdException w:name="Table Grid 5" w:semiHidden="1" w:unhideWhenUsed="1"/>
+    <w:lsdException w:name="Table Grid 6" w:semiHidden="1" w:unhideWhenUsed="1"/>
+    <w:lsdException w:name="Table Grid 7" w:semiHidden="1" w:unhideWhenUsed="1"/>
+    <w:lsdException w:name="Table Grid 8" w:semiHidden="1" w:unhideWhenUsed="1"/>
+    <w:lsdException w:name="Table List 1" w:semiHidden="1" w:unhideWhenUsed="1"/>
+    <w:lsdException w:name="Table List 2" w:semiHidden="1" w:unhideWhenUsed="1"/>
+    <w:lsdException w:name="Table List 3" w:semiHidden="1" w:unhideWhenUsed="1"/>
+    <w:lsdException w:name="Table List 4" w:semiHidden="1" w:unhideWhenUsed="1"/>
+    <w:lsdException w:name="Table List 5" w:semiHidden="1" w:unhideWhenUsed="1"/>
+    <w:lsdException w:name="Table List 6" w:semiHidden="1" w:unhideWhenUsed="1"/>
+    <w:lsdException w:name="Table List 7" w:semiHidden="1" w:unhideWhenUsed="1"/>
+    <w:lsdException w:name="Table List 8" w:semiHidden="1" w:unhideWhenUsed="1"/>
+    <w:lsdException w:name="Table 3D effects 1" w:semiHidden="1" w:unhideWhenUsed="1"/>
+    <w:lsdException w:name="Table 3D effects 2" w:semiHidden="1" w:unhideWhenUsed="1"/>
+    <w:lsdException w:name="Table 3D effects 3" w:semiHidden="1" w:unhideWhenUsed="1"/>
+    <w:lsdException w:name="Table Contemporary" w:semiHidden="1" w:unhideWhenUsed="1"/>
+    <w:lsdException w:name="Table Elegant" w:semiHidden="1" w:unhideWhenUsed="1"/>
+    <w:lsdException w:name="Table Professional" w:semiHidden="1" w:unhideWhenUsed="1"/>
+    <w:lsdException w:name="Table Subtle 1" w:semiHidden="1" w:unhideWhenUsed="1"/>
+    <w:lsdException w:name="Table Subtle 2" w:semiHidden="1" w:unhideWhenUsed="1"/>
+    <w:lsdException w:name="Table Web 1" w:semiHidden="1" w:unhideWhenUsed="1"/>
+    <w:lsdException w:name="Table Web 2" w:semiHidden="1" w:unhideWhenUsed="1"/>
+    <w:lsdException w:name="Table Web 3" w:semiHidden="1" w:unhideWhenUsed="1"/>
+    <w:lsdException w:name="Balloon Text" w:semiHidden="1" w:unhideWhenUsed="1"/>
+    <w:lsdException w:name="Table Grid" w:uiPriority="39"/>
+    <w:lsdException w:name="Table Theme" w:semiHidden="1" w:unhideWhenUsed="1"/>
+    <w:lsdException w:name="Placeholder Text" w:semiHidden="1"/>
+    <w:lsdException w:name="No Spacing" w:uiPriority="1" w:qFormat="1"/>
+    <w:lsdException w:name="Light Shading" w:uiPriority="60"/>
+    <w:lsdException w:name="Light List" w:uiPriority="61"/>
+    <w:lsdException w:name="Light Grid" w:uiPriority="62"/>
+    <w:lsdException w:name="Medium Shading 1" w:uiPriority="63"/>
+    <w:lsdException w:name="Medium Shading 2" w:uiPriority="64"/>
+    <w:lsdException w:name="Medium List 1" w:uiPriority="65"/>
+    <w:lsdException w:name="Medium List 2" w:uiPriority="66"/>
+    <w:lsdException w:name="Medium Grid 1" w:uiPriority="67"/>
+    <w:lsdException w:name="Medium Grid 2" w:uiPriority="68"/>
+    <w:lsdException w:name="Medium Grid 3" w:uiPriority="69"/>
+    <w:lsdException w:name="Dark List" w:uiPriority="70"/>
+    <w:lsdException w:name="Colorful Shading" w:uiPriority="71"/>
+    <w:lsdException w:name="Colorful List" w:uiPriority="72"/>
+    <w:lsdException w:name="Colorful Grid" w:uiPriority="73"/>
+    <w:lsdException w:name="Light Shading Accent 1" w:uiPriority="60"/>
+    <w:lsdException w:name="Light List Accent 1" w:uiPriority="61"/>
+    <w:lsdException w:name="Light Grid Accent 1" w:uiPriority="62"/>
+    <w:lsdException w:name="Medium Shading 1 Accent 1" w:uiPriority="63"/>
+    <w:lsdException w:name="Medium Shading 2 Accent 1" w:uiPriority="64"/>
+    <w:lsdException w:name="Medium List 1 Accent 1" w:uiPriority="65"/>
+    <w:lsdException w:name="Revision" w:semiHidden="1"/>
+    <w:lsdException w:name="List Paragraph" w:uiPriority="34" w:qFormat="1"/>
+    <w:lsdException w:name="Quote" w:uiPriority="29" w:qFormat="1"/>
+    <w:lsdException w:name="Intense Quote" w:uiPriority="30" w:qFormat="1"/>
+    <w:lsdException w:name="Medium List 2 Accent 1" w:uiPriority="66"/>
+    <w:lsdException w:name="Medium Grid 1 Accent 1" w:uiPriority="67"/>
+    <w:lsdException w:name="Medium Grid 2 Accent 1" w:uiPriority="68"/>
+    <w:lsdException w:name="Medium Grid 3 Accent 1" w:uiPriority="69"/>
+    <w:lsdException w:name="Dark List Accent 1" w:uiPriority="70"/>
+    <w:lsdException w:name="Colorful Shading Accent 1" w:uiPriority="71"/>
+    <w:lsdException w:name="Colorful List Accent 1" w:uiPriority="72"/>
+    <w:lsdException w:name="Colorful Grid Accent 1" w:uiPriority="73"/>
+    <w:lsdException w:name="Light Shading Accent 2" w:uiPriority="60"/>
+    <w:lsdException w:name="Light List Accent 2" w:uiPriority="61"/>
+    <w:lsdException w:name="Light Grid Accent 2" w:uiPriority="62"/>
+    <w:lsdException w:name="Medium Shading 1 Accent 2" w:uiPriority="63"/>
+    <w:lsdException w:name="Medium Shading 2 Accent 2" w:uiPriority="64"/>
+    <w:lsdException w:name="Medium List 1 Accent 2" w:uiPriority="65"/>
+    <w:lsdException w:name="Medium List 2 Accent 2" w:uiPriority="66"/>
+    <w:lsdException w:name="Medium Grid 1 Accent 2" w:uiPriority="67"/>
+    <w:lsdException w:name="Medium Grid 2 Accent 2" w:uiPriority="68"/>
+    <w:lsdException w:name="Medium Grid 3 Accent 2" w:uiPriority="69"/>
+    <w:lsdException w:name="Dark List Accent 2" w:uiPriority="70"/>
+    <w:lsdException w:name="Colorful Shading Accent 2" w:uiPriority="71"/>
+    <w:lsdException w:name="Colorful List Accent 2" w:uiPriority="72"/>
+    <w:lsdException w:name="Colorful Grid Accent 2" w:uiPriority="73"/>
+    <w:lsdException w:name="Light Shading Accent 3" w:uiPriority="60"/>
+    <w:lsdException w:name="Light List Accent 3" w:uiPriority="61"/>
+    <w:lsdException w:name="Light Grid Accent 3" w:uiPriority="62"/>
+    <w:lsdException w:name="Medium Shading 1 Accent 3" w:uiPriority="63"/>
+    <w:lsdException w:name="Medium Shading 2 Accent 3" w:uiPriority="64"/>
+    <w:lsdException w:name="Medium List 1 Accent 3" w:uiPriority="65"/>
+    <w:lsdException w:name="Medium List 2 Accent 3" w:uiPriority="66"/>
+    <w:lsdException w:name="Medium Grid 1 Accent 3" w:uiPriority="67"/>
+    <w:lsdException w:name="Medium Grid 2 Accent 3" w:uiPriority="68"/>
+    <w:lsdException w:name="Medium Grid 3 Accent 3" w:uiPriority="69"/>
+    <w:lsdException w:name="Dark List Accent 3" w:uiPriority="70"/>
+    <w:lsdException w:name="Colorful Shading Accent 3" w:uiPriority="71"/>
+    <w:lsdException w:name="Colorful List Accent 3" w:uiPriority="72"/>
+    <w:lsdException w:name="Colorful Grid Accent 3" w:uiPriority="73"/>
+    <w:lsdException w:name="Light Shading Accent 4" w:uiPriority="60"/>
+    <w:lsdException w:name="Light List Accent 4" w:uiPriority="61"/>
+    <w:lsdException w:name="Light Grid Accent 4" w:uiPriority="62"/>
+    <w:lsdException w:name="Medium Shading 1 Accent 4" w:uiPriority="63"/>
+    <w:lsdException w:name="Medium Shading 2 Accent 4" w:uiPriority="64"/>
+    <w:lsdException w:name="Medium List 1 Accent 4" w:uiPriority="65"/>
+    <w:lsdException w:name="Medium List 2 Accent 4" w:uiPriority="66"/>
+    <w:lsdException w:name="Medium Grid 1 Accent 4" w:uiPriority="67"/>
+    <w:lsdException w:name="Medium Grid 2 Accent 4" w:uiPriority="68"/>
+    <w:lsdException w:name="Medium Grid 3 Accent 4" w:uiPriority="69"/>
+    <w:lsdException w:name="Dark List Accent 4" w:uiPriority="70"/>
+    <w:lsdException w:name="Colorful Shading Accent 4" w:uiPriority="71"/>
+    <w:lsdException w:name="Colorful List Accent 4" w:uiPriority="72"/>
+    <w:lsdException w:name="Colorful Grid Accent 4" w:uiPriority="73"/>
+    <w:lsdException w:name="Light Shading Accent 5" w:uiPriority="60"/>
+    <w:lsdException w:name="Light List Accent 5" w:uiPriority="61"/>
+    <w:lsdException w:name="Light Grid Accent 5" w:uiPriority="62"/>
+    <w:lsdException w:name="Medium Shading 1 Accent 5" w:uiPriority="63"/>
+    <w:lsdException w:name="Medium Shading 2 Accent 5" w:uiPriority="64"/>
+    <w:lsdException w:name="Medium List 1 Accent 5" w:uiPriority="65"/>
+    <w:lsdException w:name="Medium List 2 Accent 5" w:uiPriority="66"/>
+    <w:lsdException w:name="Medium Grid 1 Accent 5" w:uiPriority="67"/>
+    <w:lsdException w:name="Medium Grid 2 Accent 5" w:uiPriority="68"/>
+    <w:lsdException w:name="Medium Grid 3 Accent 5" w:uiPriority="69"/>
+    <w:lsdException w:name="Dark List Accent 5" w:uiPriority="70"/>
+    <w:lsdException w:name="Colorful Shading Accent 5" w:uiPriority="71"/>
+    <w:lsdException w:name="Colorful List Accent 5" w:uiPriority="72"/>
+    <w:lsdException w:name="Colorful Grid Accent 5" w:uiPriority="73"/>
+    <w:lsdException w:name="Light Shading Accent 6" w:uiPriority="60"/>
+    <w:lsdException w:name="Light List Accent 6" w:uiPriority="61"/>
+    <w:lsdException w:name="Light Grid Accent 6" w:uiPriority="62"/>
+    <w:lsdException w:name="Medium Shading 1 Accent 6" w:uiPriority="63"/>
+    <w:lsdException w:name="Medium Shading 2 Accent 6" w:uiPriority="64"/>
+    <w:lsdException w:name="Medium List 1 Accent 6" w:uiPriority="65"/>
+    <w:lsdException w:name="Medium List 2 Accent 6" w:uiPriority="66"/>
+    <w:lsdException w:name="Medium Grid 1 Accent 6" w:uiPriority="67"/>
+    <w:lsdException w:name="Medium Grid 2 Accent 6" w:uiPriority="68"/>
+    <w:lsdException w:name="Medium Grid 3 Accent 6" w:uiPriority="69"/>
+    <w:lsdException w:name="Dark List Accent 6" w:uiPriority="70"/>
+    <w:lsdException w:name="Colorful Shading Accent 6" w:uiPriority="71"/>
+    <w:lsdException w:name="Colorful List Accent 6" w:uiPriority="72"/>
+    <w:lsdException w:name="Colorful Grid Accent 6" w:uiPriority="73"/>
+    <w:lsdException w:name="Subtle Emphasis" w:uiPriority="19" w:qFormat="1"/>
+    <w:lsdException w:name="Intense Emphasis" w:uiPriority="21" w:qFormat="1"/>
+    <w:lsdException w:name="Subtle Reference" w:uiPriority="31" w:qFormat="1"/>
+    <w:lsdException w:name="Intense Reference" w:uiPriority="32" w:qFormat="1"/>
+    <w:lsdException w:name="Book Title" w:uiPriority="33" w:qFormat="1"/>
+    <w:lsdException w:name="Bibliography" w:semiHidden="1" w:uiPriority="37" w:unhideWhenUsed="1"/>
+    <w:lsdException w:name="TOC Heading" w:semiHidden="1" w:uiPriority="39" w:unhideWhenUsed="1" w:qFormat="1"/>
+    <w:lsdException w:name="Plain Table 1" w:uiPriority="41"/>
+    <w:lsdException w:name="Plain Table 2" w:uiPriority="42"/>
+    <w:lsdException w:name="Plain Table 3" w:uiPriority="43"/>
+    <w:lsdException w:name="Plain Table 4" w:uiPriority="44"/>
+    <w:lsdException w:name="Plain Table 5" w:uiPriority="45"/>
+    <w:lsdException w:name="Grid Table Light" w:uiPriority="40"/>
+    <w:lsdException w:name="Grid Table 1 Light" w:uiPriority="46"/>
+    <w:lsdException w:name="Grid Table 2" w:uiPriority="47"/>
+    <w:lsdException w:name="Grid Table 3" w:uiPriority="48"/>
+    <w:lsdException w:name="Grid Table 4" w:uiPriority="49"/>
+    <w:lsdException w:name="Grid Table 5 Dark" w:uiPriority="50"/>
+    <w:lsdException w:name="Grid Table 6 Colorful" w:uiPriority="51"/>
+    <w:lsdException w:name="Grid Table 7 Colorful" w:uiPriority="52"/>
+    <w:lsdException w:name="Grid Table 1 Light Accent 1" w:uiPriority="46"/>
+    <w:lsdException w:name="Grid Table 2 Accent 1" w:uiPriority="47"/>
+    <w:lsdException w:name="Grid Table 3 Accent 1" w:uiPriority="48"/>
+    <w:lsdException w:name="Grid Table 4 Accent 1" w:uiPriority="49"/>
+    <w:lsdException w:name="Grid Table 5 Dark Accent 1" w:uiPriority="50"/>
+    <w:lsdException w:name="Grid Table 6 Colorful Accent 1" w:uiPriority="51"/>
+    <w:lsdException w:name="Grid Table 7 Colorful Accent 1" w:uiPriority="52"/>
+    <w:lsdException w:name="Grid Table 1 Light Accent 2" w:uiPriority="46"/>
+    <w:lsdException w:name="Grid Table 2 Accent 2" w:uiPriority="47"/>
+    <w:lsdException w:name="Grid Table 3 Accent 2" w:uiPriority="48"/>
+    <w:lsdException w:name="Grid Table 4 Accent 2" w:uiPriority="49"/>
+    <w:lsdException w:name="Grid Table 5 Dark Accent 2" w:uiPriority="50"/>
+    <w:lsdException w:name="Grid Table 6 Colorful Accent 2" w:uiPriority="51"/>
+    <w:lsdException w:name="Grid Table 7 Colorful Accent 2" w:uiPriority="52"/>
+    <w:lsdException w:name="Grid Table 1 Light Accent 3" w:uiPriority="46"/>
+    <w:lsdException w:name="Grid Table 2 Accent 3" w:uiPriority="47"/>
+    <w:lsdException w:name="Grid Table 3 Accent 3" w:uiPriority="48"/>
+    <w:lsdException w:name="Grid Table 4 Accent 3" w:uiPriority="49"/>
+    <w:lsdException w:name="Grid Table 5 Dark Accent 3" w:uiPriority="50"/>
+    <w:lsdException w:name="Grid Table 6 Colorful Accent 3" w:uiPriority="51"/>
+    <w:lsdException w:name="Grid Table 7 Colorful Accent 3" w:uiPriority="52"/>
+    <w:lsdException w:name="Grid Table 1 Light Accent 4" w:uiPriority="46"/>
+    <w:lsdException w:name="Grid Table 2 Accent 4" w:uiPriority="47"/>
+    <w:lsdException w:name="Grid Table 3 Accent 4" w:uiPriority="48"/>
+    <w:lsdException w:name="Grid Table 4 Accent 4" w:uiPriority="49"/>
+    <w:lsdException w:name="Grid Table 5 Dark Accent 4" w:uiPriority="50"/>
+    <w:lsdException w:name="Grid Table 6 Colorful Accent 4" w:uiPriority="51"/>
+    <w:lsdException w:name="Grid Table 7 Colorful Accent 4" w:uiPriority="52"/>
+    <w:lsdException w:name="Grid Table 1 Light Accent 5" w:uiPriority="46"/>
+    <w:lsdException w:name="Grid Table 2 Accent 5" w:uiPriority="47"/>
+    <w:lsdException w:name="Grid Table 3 Accent 5" w:uiPriority="48"/>
+    <w:lsdException w:name="Grid Table 4 Accent 5" w:uiPriority="49"/>
+    <w:lsdException w:name="Grid Table 5 Dark Accent 5" w:uiPriority="50"/>
+    <w:lsdException w:name="Grid Table 6 Colorful Accent 5" w:uiPriority="51"/>
+    <w:lsdException w:name="Grid Table 7 Colorful Accent 5" w:uiPriority="52"/>
+    <w:lsdException w:name="Grid Table 1 Light Accent 6" w:uiPriority="46"/>
+    <w:lsdException w:name="Grid Table 2 Accent 6" w:uiPriority="47"/>
+    <w:lsdException w:name="Grid Table 3 Accent 6" w:uiPriority="48"/>
+    <w:lsdException w:name="Grid Table 4 Accent 6" w:uiPriority="49"/>
+    <w:lsdException w:name="Grid Table 5 Dark Accent 6" w:uiPriority="50"/>
+    <w:lsdException w:name="Grid Table 6 Colorful Accent 6" w:uiPriority="51"/>
+    <w:lsdException w:name="Grid Table 7 Colorful Accent 6" w:uiPriority="52"/>
+    <w:lsdException w:name="List Table 1 Light" w:uiPriority="46"/>
+    <w:lsdException w:name="List Table 2" w:uiPriority="47"/>
+    <w:lsdException w:name="List Table 3" w:uiPriority="48"/>
+    <w:lsdException w:name="List Table 4" w:uiPriority="49"/>
+    <w:lsdException w:name="List Table 5 Dark" w:uiPriority="50"/>
+    <w:lsdException w:name="List Table 6 Colorful" w:uiPriority="51"/>
+    <w:lsdException w:name="List Table 7 Colorful" w:uiPriority="52"/>
+    <w:lsdException w:name="List Table 1 Light Accent 1" w:uiPriority="46"/>
+    <w:lsdException w:name="List Table 2 Accent 1" w:uiPriority="47"/>
+    <w:lsdException w:name="List Table 3 Accent 1" w:uiPriority="48"/>
+    <w:lsdException w:name="List Table 4 Accent 1" w:uiPriority="49"/>
+    <w:lsdException w:name="List Table 5 Dark Accent 1" w:uiPriority="50"/>
+    <w:lsdException w:name="List Table 6 Colorful Accent 1" w:uiPriority="51"/>
+    <w:lsdException w:name="List Table 7 Colorful Accent 1" w:uiPriority="52"/>
+    <w:lsdException w:name="List Table 1 Light Accent 2" w:uiPriority="46"/>
+    <w:lsdException w:name="List Table 2 Accent 2" w:uiPriority="47"/>
+    <w:lsdException w:name="List Table 3 Accent 2" w:uiPriority="48"/>
+    <w:lsdException w:name="List Table 4 Accent 2" w:uiPriority="49"/>
+    <w:lsdException w:name="List Table 5 Dark Accent 2" w:uiPriority="50"/>
+    <w:lsdException w:name="List Table 6 Colorful Accent 2" w:uiPriority="51"/>
+    <w:lsdException w:name="List Table 7 Colorful Accent 2" w:uiPriority="52"/>
+    <w:lsdException w:name="List Table 1 Light Accent 3" w:uiPriority="46"/>
+    <w:lsdException w:name="List Table 2 Accent 3" w:uiPriority="47"/>
+    <w:lsdException w:name="List Table 3 Accent 3" w:uiPriority="48"/>
+    <w:lsdException w:name="List Table 4 Accent 3" w:uiPriority="49"/>
+    <w:lsdException w:name="List Table 5 Dark Accent 3" w:uiPriority="50"/>
+    <w:lsdException w:name="List Table 6 Colorful Accent 3" w:uiPriority="51"/>
+    <w:lsdException w:name="List Table 7 Colorful Accent 3" w:uiPriority="52"/>
+    <w:lsdException w:name="List Table 1 Light Accent 4" w:uiPriority="46"/>
+    <w:lsdException w:name="List Table 2 Accent 4" w:uiPriority="47"/>
+    <w:lsdException w:name="List Table 3 Accent 4" w:uiPriority="48"/>
+    <w:lsdException w:name="List Table 4 Accent 4" w:uiPriority="49"/>
+    <w:lsdException w:name="List Table 5 Dark Accent 4" w:uiPriority="50"/>
+    <w:lsdException w:name="List Table 6 Colorful Accent 4" w:uiPriority="51"/>
+    <w:lsdException w:name="List Table 7 Colorful Accent 4" w:uiPriority="52"/>
+    <w:lsdException w:name="List Table 1 Light Accent 5" w:uiPriority="46"/>
+    <w:lsdException w:name="List Table 2 Accent 5" w:uiPriority="47"/>
+    <w:lsdException w:name="List Table 3 Accent 5" w:uiPriority="48"/>
+    <w:lsdException w:name="List Table 4 Accent 5" w:uiPriority="49"/>
+    <w:lsdException w:name="List Table 5 Dark Accent 5" w:uiPriority="50"/>
+    <w:lsdException w:name="List Table 6 Colorful Accent 5" w:uiPriority="51"/>
+    <w:lsdException w:name="List Table 7 Colorful Accent 5" w:uiPriority="52"/>
+    <w:lsdException w:name="List Table 1 Light Accent 6" w:uiPriority="46"/>
+    <w:lsdException w:name="List Table 2 Accent 6" w:uiPriority="47"/>
+    <w:lsdException w:name="List Table 3 Accent 6" w:uiPriority="48"/>
+    <w:lsdException w:name="List Table 4 Accent 6" w:uiPriority="49"/>
+    <w:lsdException w:name="List Table 5 Dark Accent 6" w:uiPriority="50"/>
+    <w:lsdException w:name="List Table 6 Colorful Accent 6" w:uiPriority="51"/>
+    <w:lsdException w:name="List Table 7 Colorful Accent 6" w:uiPriority="52"/>
+    <w:lsdException w:name="Mention" w:semiHidden="1" w:unhideWhenUsed="1"/>
+    <w:lsdException w:name="Smart Hyperlink" w:semiHidden="1" w:unhideWhenUsed="1"/>
+    <w:lsdException w:name="Hashtag" w:semiHidden="1" w:unhideWhenUsed="1"/>
+    <w:lsdException w:name="Unresolved Mention" w:semiHidden="1" w:unhideWhenUsed="1"/>
+    <w:lsdException w:name="Smart Link" w:semiHidden="1" w:unhideWhenUsed="1"/>
+  </w:latentStyles>
+  <w:style w:type="paragraph" w:default="1" w:styleId="Normal">
+    <w:name w:val="Normal"/>
+    <w:qFormat/>
+  </w:style>
+  <w:style w:type="character" w:default="1" w:styleId="Fuentedeprrafopredeter">
+    <w:name w:val="Default Paragraph Font"/>
+    <w:uiPriority w:val="1"/>
+    <w:semiHidden/>
+    <w:unhideWhenUsed/>
+  </w:style>
+  <w:style w:type="table" w:default="1" w:styleId="Tablanormal">
+    <w:name w:val="Normal Table"/>
+    <w:uiPriority w:val="99"/>
+    <w:semiHidden/>
+    <w:unhideWhenUsed/>
+    <w:tblPr>
+      <w:tblInd w:w="0" w:type="dxa"/>
+      <w:tblCellMar>
+        <w:top w:w="0" w:type="dxa"/>
+        <w:left w:w="108" w:type="dxa"/>
+        <w:bottom w:w="0" w:type="dxa"/>
+        <w:right w:w="108" w:type="dxa"/>
+      </w:tblCellMar>
+    </w:tblPr>
+  </w:style>
+  <w:style w:type="numbering" w:default="1" w:styleId="Sinlista">
+    <w:name w:val="No List"/>
+    <w:uiPriority w:val="99"/>
+    <w:semiHidden/>
+    <w:unhideWhenUsed/>
+  </w:style>
+  <w:style w:type="character" w:styleId="Textodelmarcadordeposicin">
+    <w:name w:val="Placeholder Text"/>
+    <w:basedOn w:val="Fuentedeprrafopredeter"/>
+    <w:uiPriority w:val="99"/>
+    <w:semiHidden/>
+    <w:rsid w:val="009E101F"/>
+    <w:rPr>
+      <w:color w:val="666666"/>
+    </w:rPr>
+  </w:style>
+</w:styles>
+</file>
+
+<file path=word/glossary/webSettings.xml><?xml version="1.0" encoding="utf-8"?>
+<w:webSettings xmlns:mc="http://schemas.openxmlformats.org/markup-compatibility/2006" xmlns:r="http://schemas.openxmlformats.org/officeDocument/2006/relationships" xmlns:w="http://schemas.openxmlformats.org/wordprocessingml/2006/main" xmlns:w14="http://schemas.microsoft.com/office/word/2010/wordml" xmlns:w15="http://schemas.microsoft.com/office/word/2012/wordml" xmlns:w16cex="http://schemas.microsoft.com/office/word/2018/wordml/cex" xmlns:w16cid="http://schemas.microsoft.com/office/word/2016/wordml/cid" xmlns:w16="http://schemas.microsoft.com/office/word/2018/wordml" xmlns:w16du="http://schemas.microsoft.com/office/word/2023/wordml/word16du" xmlns:w16sdtdh="http://schemas.microsoft.com/office/word/2020/wordml/sdtdatahash" xmlns:w16sdtfl="http://schemas.microsoft.com/office/word/2024/wordml/sdtformatlock" xmlns:w16se="http://schemas.microsoft.com/office/word/2015/wordml/symex" mc:Ignorable="w14 w15 w16se w16cid w16 w16cex w16sdtdh w16sdtfl w16du">
+  <w:optimizeForBrowser/>
+  <w:allowPNG/>
+</w:webSettings>
 </file>
 
 <file path=word/theme/theme1.xml><?xml version="1.0" encoding="utf-8"?>

</xml_diff>